<commit_message>
Address Service Created + misc changes.
</commit_message>
<xml_diff>
--- a/Data_Type_mapping.docx
+++ b/Data_Type_mapping.docx
@@ -295,7 +295,7 @@
     <w:p>
       <w:r>
         <w:pict w14:anchorId="10CBAC63">
-          <v:rect id="_x0000_i1049" style="width:0;height:1.5pt" o:hralign="center" o:hrstd="t" o:hr="t" fillcolor="#a0a0a0" stroked="f"/>
+          <v:rect id="_x0000_i1025" style="width:0;height:1.5pt" o:hralign="center" o:hrstd="t" o:hr="t" fillcolor="#a0a0a0" stroked="f"/>
         </w:pict>
       </w:r>
     </w:p>
@@ -446,7 +446,7 @@
     <w:p>
       <w:r>
         <w:pict w14:anchorId="70A0FE2B">
-          <v:rect id="_x0000_i1050" style="width:0;height:1.5pt" o:hralign="center" o:hrstd="t" o:hr="t" fillcolor="#a0a0a0" stroked="f"/>
+          <v:rect id="_x0000_i1026" style="width:0;height:1.5pt" o:hralign="center" o:hrstd="t" o:hr="t" fillcolor="#a0a0a0" stroked="f"/>
         </w:pict>
       </w:r>
     </w:p>
@@ -792,7 +792,7 @@
     <w:p>
       <w:r>
         <w:pict w14:anchorId="700E96D4">
-          <v:rect id="_x0000_i1575" style="width:0;height:1.5pt" o:hralign="center" o:hrstd="t" o:hr="t" fillcolor="#a0a0a0" stroked="f"/>
+          <v:rect id="_x0000_i1027" style="width:0;height:1.5pt" o:hralign="center" o:hrstd="t" o:hr="t" fillcolor="#a0a0a0" stroked="f"/>
         </w:pict>
       </w:r>
     </w:p>
@@ -888,9 +888,1156 @@
       </w:r>
     </w:p>
     <w:p>
+      <w:pPr>
+        <w:ind w:left="360"/>
+        <w:rPr>
+          <w:b/>
+          <w:bCs/>
+        </w:rPr>
+      </w:pPr>
+      <w:r>
+        <w:rPr>
+          <w:b/>
+          <w:bCs/>
+        </w:rPr>
+        <w:t>Business Rules</w:t>
+      </w:r>
+    </w:p>
+    <w:p>
+      <w:pPr>
+        <w:numPr>
+          <w:ilvl w:val="0"/>
+          <w:numId w:val="63"/>
+        </w:numPr>
+      </w:pPr>
+      <w:r>
+        <w:t xml:space="preserve">A </w:t>
+      </w:r>
+      <w:r>
+        <w:rPr>
+          <w:b/>
+          <w:bCs/>
+        </w:rPr>
+        <w:t>Customer</w:t>
+      </w:r>
+      <w:r>
+        <w:t xml:space="preserve"> can have multiple addresses.</w:t>
+      </w:r>
+    </w:p>
+    <w:p>
+      <w:pPr>
+        <w:numPr>
+          <w:ilvl w:val="0"/>
+          <w:numId w:val="63"/>
+        </w:numPr>
+      </w:pPr>
+      <w:r>
+        <w:t xml:space="preserve">Every </w:t>
+      </w:r>
+      <w:r>
+        <w:rPr>
+          <w:b/>
+          <w:bCs/>
+        </w:rPr>
+        <w:t>Address</w:t>
+      </w:r>
+      <w:r>
+        <w:t xml:space="preserve"> has an </w:t>
+      </w:r>
+      <w:proofErr w:type="spellStart"/>
+      <w:r>
+        <w:t>AddressId</w:t>
+      </w:r>
+      <w:proofErr w:type="spellEnd"/>
+      <w:r>
+        <w:t xml:space="preserve"> (DB PK) and belongs to exactly one customer.</w:t>
+      </w:r>
+    </w:p>
+    <w:p>
+      <w:pPr>
+        <w:numPr>
+          <w:ilvl w:val="0"/>
+          <w:numId w:val="63"/>
+        </w:numPr>
+      </w:pPr>
+      <w:r>
+        <w:t xml:space="preserve">A </w:t>
+      </w:r>
+      <w:r>
+        <w:rPr>
+          <w:b/>
+          <w:bCs/>
+        </w:rPr>
+        <w:t>logged-in customer</w:t>
+      </w:r>
+      <w:r>
+        <w:t xml:space="preserve"> can:</w:t>
+      </w:r>
+    </w:p>
+    <w:p>
+      <w:pPr>
+        <w:numPr>
+          <w:ilvl w:val="1"/>
+          <w:numId w:val="63"/>
+        </w:numPr>
+      </w:pPr>
+      <w:r>
+        <w:rPr>
+          <w:b/>
+          <w:bCs/>
+        </w:rPr>
+        <w:t>Add</w:t>
+      </w:r>
+      <w:r>
+        <w:t xml:space="preserve"> new addresses</w:t>
+      </w:r>
+    </w:p>
+    <w:p>
+      <w:pPr>
+        <w:numPr>
+          <w:ilvl w:val="1"/>
+          <w:numId w:val="63"/>
+        </w:numPr>
+      </w:pPr>
+      <w:r>
+        <w:rPr>
+          <w:b/>
+          <w:bCs/>
+        </w:rPr>
+        <w:t>Edit/Update</w:t>
+      </w:r>
+      <w:r>
+        <w:t xml:space="preserve"> their own existing addresses</w:t>
+      </w:r>
+    </w:p>
+    <w:p>
+      <w:pPr>
+        <w:numPr>
+          <w:ilvl w:val="1"/>
+          <w:numId w:val="63"/>
+        </w:numPr>
+      </w:pPr>
+      <w:r>
+        <w:rPr>
+          <w:b/>
+          <w:bCs/>
+        </w:rPr>
+        <w:t>Delete</w:t>
+      </w:r>
+      <w:r>
+        <w:t xml:space="preserve"> their own addresses</w:t>
+      </w:r>
+    </w:p>
+    <w:p>
+      <w:pPr>
+        <w:numPr>
+          <w:ilvl w:val="0"/>
+          <w:numId w:val="63"/>
+        </w:numPr>
+      </w:pPr>
+      <w:r>
+        <w:t>No cross-customer access (enforced by ownership check).</w:t>
+      </w:r>
+    </w:p>
+    <w:p>
+      <w:pPr>
+        <w:ind w:left="360"/>
+        <w:rPr>
+          <w:b/>
+          <w:bCs/>
+        </w:rPr>
+      </w:pPr>
+      <w:r>
+        <w:rPr>
+          <w:b/>
+          <w:bCs/>
+        </w:rPr>
+        <w:t>1. Delete Address</w:t>
+      </w:r>
+    </w:p>
+    <w:p>
+      <w:pPr>
+        <w:numPr>
+          <w:ilvl w:val="0"/>
+          <w:numId w:val="66"/>
+        </w:numPr>
+      </w:pPr>
+      <w:r>
+        <w:rPr>
+          <w:b/>
+          <w:bCs/>
+        </w:rPr>
+        <w:t xml:space="preserve">UI </w:t>
+      </w:r>
+      <w:proofErr w:type="spellStart"/>
+      <w:r>
+        <w:rPr>
+          <w:b/>
+          <w:bCs/>
+        </w:rPr>
+        <w:t>behavior</w:t>
+      </w:r>
+      <w:proofErr w:type="spellEnd"/>
+      <w:r>
+        <w:t xml:space="preserve">: The user clicks </w:t>
+      </w:r>
+      <w:r>
+        <w:rPr>
+          <w:i/>
+          <w:iCs/>
+        </w:rPr>
+        <w:t>Delete</w:t>
+      </w:r>
+      <w:r>
+        <w:t xml:space="preserve"> on a specific address card.</w:t>
+      </w:r>
+    </w:p>
+    <w:p>
+      <w:pPr>
+        <w:numPr>
+          <w:ilvl w:val="0"/>
+          <w:numId w:val="66"/>
+        </w:numPr>
+      </w:pPr>
+      <w:r>
+        <w:rPr>
+          <w:b/>
+          <w:bCs/>
+        </w:rPr>
+        <w:t>What gets sent to backend</w:t>
+      </w:r>
+      <w:r>
+        <w:t>:</w:t>
+      </w:r>
+    </w:p>
+    <w:p>
+      <w:pPr>
+        <w:numPr>
+          <w:ilvl w:val="1"/>
+          <w:numId w:val="66"/>
+        </w:numPr>
+      </w:pPr>
+      <w:proofErr w:type="spellStart"/>
+      <w:r>
+        <w:rPr>
+          <w:b/>
+          <w:bCs/>
+        </w:rPr>
+        <w:t>AddressId</w:t>
+      </w:r>
+      <w:proofErr w:type="spellEnd"/>
+      <w:r>
+        <w:t xml:space="preserve"> (because the address already exists, no need for </w:t>
+      </w:r>
+      <w:proofErr w:type="spellStart"/>
+      <w:r>
+        <w:t>UserId</w:t>
+      </w:r>
+      <w:proofErr w:type="spellEnd"/>
+      <w:r>
+        <w:t xml:space="preserve"> if we already know which user is logged in from the session/token).</w:t>
+      </w:r>
+    </w:p>
+    <w:p>
+      <w:pPr>
+        <w:numPr>
+          <w:ilvl w:val="0"/>
+          <w:numId w:val="66"/>
+        </w:numPr>
+      </w:pPr>
+      <w:r>
+        <w:rPr>
+          <w:b/>
+          <w:bCs/>
+        </w:rPr>
+        <w:t>Backend check</w:t>
+      </w:r>
+      <w:r>
+        <w:t xml:space="preserve">: The API should check that the logged-in user </w:t>
+      </w:r>
+      <w:proofErr w:type="gramStart"/>
+      <w:r>
+        <w:t>actually owns</w:t>
+      </w:r>
+      <w:proofErr w:type="gramEnd"/>
+      <w:r>
+        <w:t xml:space="preserve"> that address before deleting it. This prevents unauthorized deletion.</w:t>
+      </w:r>
+    </w:p>
+    <w:p>
+      <w:pPr>
+        <w:ind w:left="360"/>
+      </w:pPr>
+      <w:r>
+        <w:rPr>
+          <w:rFonts w:ascii="Segoe UI Emoji" w:hAnsi="Segoe UI Emoji" w:cs="Segoe UI Emoji"/>
+        </w:rPr>
+        <w:t>✅</w:t>
+      </w:r>
+      <w:r>
+        <w:t xml:space="preserve"> Example request:</w:t>
+      </w:r>
+    </w:p>
+    <w:p>
+      <w:pPr>
+        <w:ind w:left="360"/>
+      </w:pPr>
+      <w:r>
+        <w:t>DELETE /</w:t>
+      </w:r>
+      <w:proofErr w:type="spellStart"/>
+      <w:r>
+        <w:t>api</w:t>
+      </w:r>
+      <w:proofErr w:type="spellEnd"/>
+      <w:r>
+        <w:t>/addresses/123</w:t>
+      </w:r>
+    </w:p>
+    <w:p>
+      <w:pPr>
+        <w:ind w:left="360"/>
+      </w:pPr>
+      <w:r>
+        <w:t>Authorization: Bearer &lt;user-token&gt;</w:t>
+      </w:r>
+    </w:p>
+    <w:p>
+      <w:pPr>
+        <w:ind w:left="360"/>
+      </w:pPr>
+      <w:r>
+        <w:pict w14:anchorId="146D9BA9">
+          <v:rect id="_x0000_i1147" style="width:0;height:1.5pt" o:hralign="center" o:hrstd="t" o:hr="t" fillcolor="#a0a0a0" stroked="f"/>
+        </w:pict>
+      </w:r>
+    </w:p>
+    <w:p>
+      <w:pPr>
+        <w:ind w:left="360"/>
+        <w:rPr>
+          <w:b/>
+          <w:bCs/>
+        </w:rPr>
+      </w:pPr>
+      <w:r>
+        <w:rPr>
+          <w:b/>
+          <w:bCs/>
+        </w:rPr>
+        <w:t>2. Update Address</w:t>
+      </w:r>
+    </w:p>
+    <w:p>
+      <w:pPr>
+        <w:numPr>
+          <w:ilvl w:val="0"/>
+          <w:numId w:val="67"/>
+        </w:numPr>
+      </w:pPr>
+      <w:r>
+        <w:rPr>
+          <w:b/>
+          <w:bCs/>
+        </w:rPr>
+        <w:t xml:space="preserve">UI </w:t>
+      </w:r>
+      <w:proofErr w:type="spellStart"/>
+      <w:r>
+        <w:rPr>
+          <w:b/>
+          <w:bCs/>
+        </w:rPr>
+        <w:t>behavior</w:t>
+      </w:r>
+      <w:proofErr w:type="spellEnd"/>
+      <w:r>
+        <w:t xml:space="preserve">: User edits the fields in an </w:t>
+      </w:r>
+      <w:r>
+        <w:rPr>
+          <w:i/>
+          <w:iCs/>
+        </w:rPr>
+        <w:t>Edit Address</w:t>
+      </w:r>
+      <w:r>
+        <w:t xml:space="preserve"> form and clicks </w:t>
+      </w:r>
+      <w:r>
+        <w:rPr>
+          <w:i/>
+          <w:iCs/>
+        </w:rPr>
+        <w:t>Save</w:t>
+      </w:r>
+      <w:r>
+        <w:t>.</w:t>
+      </w:r>
+    </w:p>
+    <w:p>
+      <w:pPr>
+        <w:numPr>
+          <w:ilvl w:val="0"/>
+          <w:numId w:val="67"/>
+        </w:numPr>
+      </w:pPr>
+      <w:r>
+        <w:rPr>
+          <w:b/>
+          <w:bCs/>
+        </w:rPr>
+        <w:t>What gets sent to backend</w:t>
+      </w:r>
+      <w:r>
+        <w:t>:</w:t>
+      </w:r>
+    </w:p>
+    <w:p>
+      <w:pPr>
+        <w:numPr>
+          <w:ilvl w:val="1"/>
+          <w:numId w:val="67"/>
+        </w:numPr>
+      </w:pPr>
+      <w:proofErr w:type="spellStart"/>
+      <w:r>
+        <w:rPr>
+          <w:b/>
+          <w:bCs/>
+        </w:rPr>
+        <w:t>AddressId</w:t>
+      </w:r>
+      <w:proofErr w:type="spellEnd"/>
+      <w:r>
+        <w:t xml:space="preserve"> (the existing one being updated).</w:t>
+      </w:r>
+    </w:p>
+    <w:p>
+      <w:pPr>
+        <w:numPr>
+          <w:ilvl w:val="1"/>
+          <w:numId w:val="67"/>
+        </w:numPr>
+      </w:pPr>
+      <w:r>
+        <w:rPr>
+          <w:b/>
+          <w:bCs/>
+        </w:rPr>
+        <w:t>Updated address fields</w:t>
+      </w:r>
+      <w:r>
+        <w:t xml:space="preserve"> (StreetLine1, City, State, etc).</w:t>
+      </w:r>
+    </w:p>
+    <w:p>
+      <w:pPr>
+        <w:numPr>
+          <w:ilvl w:val="0"/>
+          <w:numId w:val="67"/>
+        </w:numPr>
+      </w:pPr>
+      <w:r>
+        <w:rPr>
+          <w:b/>
+          <w:bCs/>
+        </w:rPr>
+        <w:t>Backend check</w:t>
+      </w:r>
+      <w:r>
+        <w:t xml:space="preserve">: Again, verify that the </w:t>
+      </w:r>
+      <w:proofErr w:type="spellStart"/>
+      <w:r>
+        <w:t>AddressId</w:t>
+      </w:r>
+      <w:proofErr w:type="spellEnd"/>
+      <w:r>
+        <w:t xml:space="preserve"> belongs to the logged-in user.</w:t>
+      </w:r>
+    </w:p>
+    <w:p>
+      <w:pPr>
+        <w:ind w:left="360"/>
+      </w:pPr>
+      <w:r>
+        <w:rPr>
+          <w:rFonts w:ascii="Segoe UI Emoji" w:hAnsi="Segoe UI Emoji" w:cs="Segoe UI Emoji"/>
+        </w:rPr>
+        <w:t>✅</w:t>
+      </w:r>
+      <w:r>
+        <w:t xml:space="preserve"> Example request:</w:t>
+      </w:r>
+    </w:p>
+    <w:p>
+      <w:pPr>
+        <w:ind w:left="360"/>
+      </w:pPr>
+      <w:r>
+        <w:t>PUT /</w:t>
+      </w:r>
+      <w:proofErr w:type="spellStart"/>
+      <w:r>
+        <w:t>api</w:t>
+      </w:r>
+      <w:proofErr w:type="spellEnd"/>
+      <w:r>
+        <w:t>/addresses/123</w:t>
+      </w:r>
+    </w:p>
+    <w:p>
+      <w:pPr>
+        <w:ind w:left="360"/>
+      </w:pPr>
+      <w:r>
+        <w:t>Authorization: Bearer &lt;user-token&gt;</w:t>
+      </w:r>
+    </w:p>
+    <w:p>
+      <w:pPr>
+        <w:ind w:left="360"/>
+      </w:pPr>
+      <w:r>
+        <w:t>Body:</w:t>
+      </w:r>
+    </w:p>
+    <w:p>
+      <w:pPr>
+        <w:ind w:left="360"/>
+      </w:pPr>
+      <w:r>
+        <w:t>{</w:t>
+      </w:r>
+    </w:p>
+    <w:p>
+      <w:pPr>
+        <w:ind w:left="360"/>
+      </w:pPr>
+      <w:r>
+        <w:t xml:space="preserve">  "streetLine1": "New Street",</w:t>
+      </w:r>
+    </w:p>
+    <w:p>
+      <w:pPr>
+        <w:ind w:left="360"/>
+      </w:pPr>
+      <w:r>
+        <w:t xml:space="preserve">  "city": "Mumbai",</w:t>
+      </w:r>
+    </w:p>
+    <w:p>
+      <w:pPr>
+        <w:ind w:left="360"/>
+      </w:pPr>
+      <w:r>
+        <w:t xml:space="preserve">  "state": "MH",</w:t>
+      </w:r>
+    </w:p>
+    <w:p>
+      <w:pPr>
+        <w:ind w:left="360"/>
+      </w:pPr>
+      <w:r>
+        <w:t xml:space="preserve">  "</w:t>
+      </w:r>
+      <w:proofErr w:type="spellStart"/>
+      <w:r>
+        <w:t>pinCode</w:t>
+      </w:r>
+      <w:proofErr w:type="spellEnd"/>
+      <w:r>
+        <w:t>": "400001"</w:t>
+      </w:r>
+    </w:p>
+    <w:p>
+      <w:pPr>
+        <w:ind w:left="360"/>
+      </w:pPr>
+      <w:r>
+        <w:t>}</w:t>
+      </w:r>
+    </w:p>
+    <w:p>
+      <w:pPr>
+        <w:ind w:left="360"/>
+      </w:pPr>
+      <w:r>
+        <w:pict w14:anchorId="4BF9708B">
+          <v:rect id="_x0000_i1148" style="width:0;height:1.5pt" o:hralign="center" o:hrstd="t" o:hr="t" fillcolor="#a0a0a0" stroked="f"/>
+        </w:pict>
+      </w:r>
+    </w:p>
+    <w:p>
+      <w:pPr>
+        <w:ind w:left="360"/>
+        <w:rPr>
+          <w:b/>
+          <w:bCs/>
+        </w:rPr>
+      </w:pPr>
+      <w:r>
+        <w:rPr>
+          <w:b/>
+          <w:bCs/>
+        </w:rPr>
+        <w:t>3. Create Address</w:t>
+      </w:r>
+    </w:p>
+    <w:p>
+      <w:pPr>
+        <w:numPr>
+          <w:ilvl w:val="0"/>
+          <w:numId w:val="68"/>
+        </w:numPr>
+      </w:pPr>
+      <w:r>
+        <w:rPr>
+          <w:b/>
+          <w:bCs/>
+        </w:rPr>
+        <w:t xml:space="preserve">UI </w:t>
+      </w:r>
+      <w:proofErr w:type="spellStart"/>
+      <w:r>
+        <w:rPr>
+          <w:b/>
+          <w:bCs/>
+        </w:rPr>
+        <w:t>behavior</w:t>
+      </w:r>
+      <w:proofErr w:type="spellEnd"/>
+      <w:r>
+        <w:t xml:space="preserve">: User fills out a </w:t>
+      </w:r>
+      <w:r>
+        <w:rPr>
+          <w:i/>
+          <w:iCs/>
+        </w:rPr>
+        <w:t>New Address</w:t>
+      </w:r>
+      <w:r>
+        <w:t xml:space="preserve"> form and clicks </w:t>
+      </w:r>
+      <w:r>
+        <w:rPr>
+          <w:i/>
+          <w:iCs/>
+        </w:rPr>
+        <w:t>Add Address</w:t>
+      </w:r>
+      <w:r>
+        <w:t>.</w:t>
+      </w:r>
+    </w:p>
+    <w:p>
+      <w:pPr>
+        <w:numPr>
+          <w:ilvl w:val="0"/>
+          <w:numId w:val="68"/>
+        </w:numPr>
+      </w:pPr>
+      <w:r>
+        <w:rPr>
+          <w:b/>
+          <w:bCs/>
+        </w:rPr>
+        <w:t>What gets sent to backend</w:t>
+      </w:r>
+      <w:r>
+        <w:t>:</w:t>
+      </w:r>
+    </w:p>
+    <w:p>
+      <w:pPr>
+        <w:numPr>
+          <w:ilvl w:val="1"/>
+          <w:numId w:val="68"/>
+        </w:numPr>
+      </w:pPr>
+      <w:r>
+        <w:rPr>
+          <w:b/>
+          <w:bCs/>
+        </w:rPr>
+        <w:t>Only address fields</w:t>
+      </w:r>
+      <w:r>
+        <w:t xml:space="preserve"> (StreetLine1, City, </w:t>
+      </w:r>
+      <w:proofErr w:type="spellStart"/>
+      <w:r>
+        <w:t>PinCode</w:t>
+      </w:r>
+      <w:proofErr w:type="spellEnd"/>
+      <w:r>
+        <w:t>, etc).</w:t>
+      </w:r>
+    </w:p>
+    <w:p>
+      <w:pPr>
+        <w:numPr>
+          <w:ilvl w:val="1"/>
+          <w:numId w:val="68"/>
+        </w:numPr>
+      </w:pPr>
+      <w:r>
+        <w:rPr>
+          <w:b/>
+          <w:bCs/>
+        </w:rPr>
+        <w:t xml:space="preserve">NOT </w:t>
+      </w:r>
+      <w:proofErr w:type="spellStart"/>
+      <w:r>
+        <w:rPr>
+          <w:b/>
+          <w:bCs/>
+        </w:rPr>
+        <w:t>userId</w:t>
+      </w:r>
+      <w:proofErr w:type="spellEnd"/>
+      <w:r>
+        <w:rPr>
+          <w:b/>
+          <w:bCs/>
+        </w:rPr>
+        <w:t xml:space="preserve"> explicitly</w:t>
+      </w:r>
+      <w:r>
+        <w:t xml:space="preserve"> (since backend can extract the </w:t>
+      </w:r>
+      <w:proofErr w:type="spellStart"/>
+      <w:r>
+        <w:t>userId</w:t>
+      </w:r>
+      <w:proofErr w:type="spellEnd"/>
+      <w:r>
+        <w:t xml:space="preserve"> from the logged-in user’s token/claims).</w:t>
+      </w:r>
+    </w:p>
+    <w:p>
+      <w:pPr>
+        <w:numPr>
+          <w:ilvl w:val="0"/>
+          <w:numId w:val="68"/>
+        </w:numPr>
+      </w:pPr>
+      <w:r>
+        <w:rPr>
+          <w:b/>
+          <w:bCs/>
+        </w:rPr>
+        <w:t xml:space="preserve">Backend </w:t>
+      </w:r>
+      <w:proofErr w:type="spellStart"/>
+      <w:r>
+        <w:rPr>
+          <w:b/>
+          <w:bCs/>
+        </w:rPr>
+        <w:t>behavior</w:t>
+      </w:r>
+      <w:proofErr w:type="spellEnd"/>
+      <w:r>
+        <w:t xml:space="preserve">: The API attaches the address to the logged-in user’s </w:t>
+      </w:r>
+      <w:proofErr w:type="spellStart"/>
+      <w:r>
+        <w:t>UserId</w:t>
+      </w:r>
+      <w:proofErr w:type="spellEnd"/>
+      <w:r>
+        <w:t>.</w:t>
+      </w:r>
+    </w:p>
+    <w:p>
+      <w:pPr>
+        <w:ind w:left="360"/>
+      </w:pPr>
+      <w:r>
+        <w:rPr>
+          <w:rFonts w:ascii="Segoe UI Emoji" w:hAnsi="Segoe UI Emoji" w:cs="Segoe UI Emoji"/>
+        </w:rPr>
+        <w:t>✅</w:t>
+      </w:r>
+      <w:r>
+        <w:t xml:space="preserve"> Example request:</w:t>
+      </w:r>
+    </w:p>
+    <w:p>
+      <w:pPr>
+        <w:ind w:left="360"/>
+      </w:pPr>
+      <w:r>
+        <w:t>POST /</w:t>
+      </w:r>
+      <w:proofErr w:type="spellStart"/>
+      <w:r>
+        <w:t>api</w:t>
+      </w:r>
+      <w:proofErr w:type="spellEnd"/>
+      <w:r>
+        <w:t>/addresses</w:t>
+      </w:r>
+    </w:p>
+    <w:p>
+      <w:pPr>
+        <w:ind w:left="360"/>
+      </w:pPr>
+      <w:r>
+        <w:t>Authorization: Bearer &lt;user-token&gt;</w:t>
+      </w:r>
+    </w:p>
+    <w:p>
+      <w:pPr>
+        <w:ind w:left="360"/>
+      </w:pPr>
+      <w:r>
+        <w:t>Body:</w:t>
+      </w:r>
+    </w:p>
+    <w:p>
+      <w:pPr>
+        <w:ind w:left="360"/>
+      </w:pPr>
+      <w:r>
+        <w:t>{</w:t>
+      </w:r>
+    </w:p>
+    <w:p>
+      <w:pPr>
+        <w:ind w:left="360"/>
+      </w:pPr>
+      <w:r>
+        <w:t xml:space="preserve">  "streetLine1": "123 New Road",</w:t>
+      </w:r>
+    </w:p>
+    <w:p>
+      <w:pPr>
+        <w:ind w:left="360"/>
+      </w:pPr>
+      <w:r>
+        <w:t xml:space="preserve">  "city": "Bangalore",</w:t>
+      </w:r>
+    </w:p>
+    <w:p>
+      <w:pPr>
+        <w:ind w:left="360"/>
+      </w:pPr>
+      <w:r>
+        <w:t xml:space="preserve">  "state": "KA",</w:t>
+      </w:r>
+    </w:p>
+    <w:p>
+      <w:pPr>
+        <w:ind w:left="360"/>
+      </w:pPr>
+      <w:r>
+        <w:t xml:space="preserve">  "</w:t>
+      </w:r>
+      <w:proofErr w:type="spellStart"/>
+      <w:r>
+        <w:t>pinCode</w:t>
+      </w:r>
+      <w:proofErr w:type="spellEnd"/>
+      <w:r>
+        <w:t>": "560001"</w:t>
+      </w:r>
+    </w:p>
+    <w:p>
+      <w:pPr>
+        <w:ind w:left="360"/>
+      </w:pPr>
+      <w:r>
+        <w:t>}</w:t>
+      </w:r>
+    </w:p>
+    <w:p>
+      <w:pPr>
+        <w:ind w:left="360"/>
+      </w:pPr>
+      <w:r>
+        <w:pict w14:anchorId="3B5F6FA5">
+          <v:rect id="_x0000_i1149" style="width:0;height:1.5pt" o:hralign="center" o:hrstd="t" o:hr="t" fillcolor="#a0a0a0" stroked="f"/>
+        </w:pict>
+      </w:r>
+    </w:p>
+    <w:p>
+      <w:pPr>
+        <w:ind w:left="360"/>
+        <w:rPr>
+          <w:b/>
+          <w:bCs/>
+        </w:rPr>
+      </w:pPr>
+      <w:r>
+        <w:rPr>
+          <w:b/>
+          <w:bCs/>
+        </w:rPr>
+        <w:t>4. Get All Addresses</w:t>
+      </w:r>
+    </w:p>
+    <w:p>
+      <w:pPr>
+        <w:numPr>
+          <w:ilvl w:val="0"/>
+          <w:numId w:val="69"/>
+        </w:numPr>
+      </w:pPr>
+      <w:r>
+        <w:rPr>
+          <w:b/>
+          <w:bCs/>
+        </w:rPr>
+        <w:t xml:space="preserve">UI </w:t>
+      </w:r>
+      <w:proofErr w:type="spellStart"/>
+      <w:r>
+        <w:rPr>
+          <w:b/>
+          <w:bCs/>
+        </w:rPr>
+        <w:t>behavior</w:t>
+      </w:r>
+      <w:proofErr w:type="spellEnd"/>
+      <w:r>
+        <w:t xml:space="preserve">: User visits </w:t>
+      </w:r>
+      <w:r>
+        <w:rPr>
+          <w:i/>
+          <w:iCs/>
+        </w:rPr>
+        <w:t>My Addresses</w:t>
+      </w:r>
+      <w:r>
+        <w:t xml:space="preserve"> page.</w:t>
+      </w:r>
+    </w:p>
+    <w:p>
+      <w:pPr>
+        <w:numPr>
+          <w:ilvl w:val="0"/>
+          <w:numId w:val="69"/>
+        </w:numPr>
+      </w:pPr>
+      <w:r>
+        <w:rPr>
+          <w:b/>
+          <w:bCs/>
+        </w:rPr>
+        <w:t>What gets sent to backend</w:t>
+      </w:r>
+      <w:r>
+        <w:t>:</w:t>
+      </w:r>
+    </w:p>
+    <w:p>
+      <w:pPr>
+        <w:numPr>
+          <w:ilvl w:val="1"/>
+          <w:numId w:val="69"/>
+        </w:numPr>
+      </w:pPr>
+      <w:r>
+        <w:t>Nothing extra — backend already knows the logged-in user.</w:t>
+      </w:r>
+    </w:p>
+    <w:p>
+      <w:pPr>
+        <w:numPr>
+          <w:ilvl w:val="0"/>
+          <w:numId w:val="69"/>
+        </w:numPr>
+      </w:pPr>
+      <w:r>
+        <w:rPr>
+          <w:b/>
+          <w:bCs/>
+        </w:rPr>
+        <w:t xml:space="preserve">Backend </w:t>
+      </w:r>
+      <w:proofErr w:type="spellStart"/>
+      <w:r>
+        <w:rPr>
+          <w:b/>
+          <w:bCs/>
+        </w:rPr>
+        <w:t>behavior</w:t>
+      </w:r>
+      <w:proofErr w:type="spellEnd"/>
+      <w:r>
+        <w:t>: Return only addresses linked to that user.</w:t>
+      </w:r>
+    </w:p>
+    <w:p>
+      <w:pPr>
+        <w:ind w:left="360"/>
+      </w:pPr>
+      <w:r>
+        <w:rPr>
+          <w:rFonts w:ascii="Segoe UI Emoji" w:hAnsi="Segoe UI Emoji" w:cs="Segoe UI Emoji"/>
+        </w:rPr>
+        <w:t>✅</w:t>
+      </w:r>
+      <w:r>
+        <w:t xml:space="preserve"> Example request:</w:t>
+      </w:r>
+    </w:p>
+    <w:p>
+      <w:pPr>
+        <w:ind w:left="360"/>
+      </w:pPr>
+      <w:r>
+        <w:t>GET /</w:t>
+      </w:r>
+      <w:proofErr w:type="spellStart"/>
+      <w:r>
+        <w:t>api</w:t>
+      </w:r>
+      <w:proofErr w:type="spellEnd"/>
+      <w:r>
+        <w:t>/addresses</w:t>
+      </w:r>
+    </w:p>
+    <w:p>
+      <w:pPr>
+        <w:ind w:left="360"/>
+      </w:pPr>
+      <w:r>
+        <w:t>Authorization: Bearer &lt;user-token&gt;</w:t>
+      </w:r>
+    </w:p>
+    <w:p>
+      <w:pPr>
+        <w:ind w:left="360"/>
+      </w:pPr>
+      <w:r>
+        <w:pict w14:anchorId="574ADD0A">
+          <v:rect id="_x0000_i1150" style="width:0;height:1.5pt" o:hralign="center" o:hrstd="t" o:hr="t" fillcolor="#a0a0a0" stroked="f"/>
+        </w:pict>
+      </w:r>
+    </w:p>
+    <w:p>
+      <w:pPr>
+        <w:ind w:left="360"/>
+        <w:rPr>
+          <w:b/>
+          <w:bCs/>
+        </w:rPr>
+      </w:pPr>
+      <w:r>
+        <w:rPr>
+          <w:rFonts w:ascii="Segoe UI Emoji" w:hAnsi="Segoe UI Emoji" w:cs="Segoe UI Emoji"/>
+          <w:b/>
+          <w:bCs/>
+        </w:rPr>
+        <w:t>🔑</w:t>
+      </w:r>
+      <w:r>
+        <w:rPr>
+          <w:b/>
+          <w:bCs/>
+        </w:rPr>
+        <w:t xml:space="preserve"> Architect’s Principle</w:t>
+      </w:r>
+    </w:p>
+    <w:p>
+      <w:pPr>
+        <w:numPr>
+          <w:ilvl w:val="0"/>
+          <w:numId w:val="70"/>
+        </w:numPr>
+      </w:pPr>
+      <w:proofErr w:type="gramStart"/>
+      <w:r>
+        <w:t>Don’t</w:t>
+      </w:r>
+      <w:proofErr w:type="gramEnd"/>
+      <w:r>
+        <w:t xml:space="preserve"> pass </w:t>
+      </w:r>
+      <w:proofErr w:type="spellStart"/>
+      <w:r>
+        <w:t>UserId</w:t>
+      </w:r>
+      <w:proofErr w:type="spellEnd"/>
+      <w:r>
+        <w:t xml:space="preserve"> from UI for security reasons — rely on the logged-in user’s </w:t>
+      </w:r>
+      <w:r>
+        <w:rPr>
+          <w:b/>
+          <w:bCs/>
+        </w:rPr>
+        <w:t xml:space="preserve">JWT token / </w:t>
+      </w:r>
+      <w:proofErr w:type="spellStart"/>
+      <w:r>
+        <w:rPr>
+          <w:b/>
+          <w:bCs/>
+        </w:rPr>
+        <w:t>ClaimsPrincipal</w:t>
+      </w:r>
+      <w:proofErr w:type="spellEnd"/>
+      <w:r>
+        <w:t>.</w:t>
+      </w:r>
+    </w:p>
+    <w:p>
+      <w:pPr>
+        <w:numPr>
+          <w:ilvl w:val="0"/>
+          <w:numId w:val="70"/>
+        </w:numPr>
+      </w:pPr>
+      <w:r>
+        <w:t xml:space="preserve">Only pass </w:t>
+      </w:r>
+      <w:proofErr w:type="spellStart"/>
+      <w:r>
+        <w:t>AddressId</w:t>
+      </w:r>
+      <w:proofErr w:type="spellEnd"/>
+      <w:r>
+        <w:t xml:space="preserve"> when modifying/deleting an existing address.</w:t>
+      </w:r>
+    </w:p>
+    <w:p>
+      <w:pPr>
+        <w:numPr>
+          <w:ilvl w:val="0"/>
+          <w:numId w:val="70"/>
+        </w:numPr>
+      </w:pPr>
+      <w:r>
+        <w:t xml:space="preserve">On </w:t>
+      </w:r>
+      <w:r>
+        <w:rPr>
+          <w:b/>
+          <w:bCs/>
+        </w:rPr>
+        <w:t>create</w:t>
+      </w:r>
+      <w:r>
+        <w:t>, backend should automatically link the address with the logged-in user.</w:t>
+      </w:r>
+    </w:p>
+    <w:p>
+      <w:pPr>
+        <w:ind w:left="360"/>
+      </w:pPr>
+    </w:p>
+    <w:p>
       <w:r>
         <w:pict w14:anchorId="7ABD477C">
-          <v:rect id="_x0000_i1576" style="width:0;height:1.5pt" o:hralign="center" o:hrstd="t" o:hr="t" fillcolor="#a0a0a0" stroked="f"/>
+          <v:rect id="_x0000_i1028" style="width:0;height:1.5pt" o:hralign="center" o:hrstd="t" o:hr="t" fillcolor="#a0a0a0" stroked="f"/>
         </w:pict>
       </w:r>
     </w:p>
@@ -988,7 +2135,7 @@
     <w:p>
       <w:r>
         <w:pict w14:anchorId="4A6C65A5">
-          <v:rect id="_x0000_i1577" style="width:0;height:1.5pt" o:hralign="center" o:hrstd="t" o:hr="t" fillcolor="#a0a0a0" stroked="f"/>
+          <v:rect id="_x0000_i1029" style="width:0;height:1.5pt" o:hralign="center" o:hrstd="t" o:hr="t" fillcolor="#a0a0a0" stroked="f"/>
         </w:pict>
       </w:r>
     </w:p>
@@ -1086,7 +2233,7 @@
     <w:p>
       <w:r>
         <w:pict w14:anchorId="3B843FB0">
-          <v:rect id="_x0000_i1578" style="width:0;height:1.5pt" o:hralign="center" o:hrstd="t" o:hr="t" fillcolor="#a0a0a0" stroked="f"/>
+          <v:rect id="_x0000_i1030" style="width:0;height:1.5pt" o:hralign="center" o:hrstd="t" o:hr="t" fillcolor="#a0a0a0" stroked="f"/>
         </w:pict>
       </w:r>
     </w:p>
@@ -1195,7 +2342,7 @@
     <w:p>
       <w:r>
         <w:pict w14:anchorId="5B8C071F">
-          <v:rect id="_x0000_i1579" style="width:0;height:1.5pt" o:hralign="center" o:hrstd="t" o:hr="t" fillcolor="#a0a0a0" stroked="f"/>
+          <v:rect id="_x0000_i1031" style="width:0;height:1.5pt" o:hralign="center" o:hrstd="t" o:hr="t" fillcolor="#a0a0a0" stroked="f"/>
         </w:pict>
       </w:r>
     </w:p>
@@ -1312,7 +2459,7 @@
     <w:p>
       <w:r>
         <w:pict w14:anchorId="25FA1558">
-          <v:rect id="_x0000_i1580" style="width:0;height:1.5pt" o:hralign="center" o:hrstd="t" o:hr="t" fillcolor="#a0a0a0" stroked="f"/>
+          <v:rect id="_x0000_i1032" style="width:0;height:1.5pt" o:hralign="center" o:hrstd="t" o:hr="t" fillcolor="#a0a0a0" stroked="f"/>
         </w:pict>
       </w:r>
     </w:p>
@@ -1431,7 +2578,7 @@
     <w:p>
       <w:r>
         <w:pict w14:anchorId="061185B9">
-          <v:rect id="_x0000_i1581" style="width:0;height:1.5pt" o:hralign="center" o:hrstd="t" o:hr="t" fillcolor="#a0a0a0" stroked="f"/>
+          <v:rect id="_x0000_i1033" style="width:0;height:1.5pt" o:hralign="center" o:hrstd="t" o:hr="t" fillcolor="#a0a0a0" stroked="f"/>
         </w:pict>
       </w:r>
     </w:p>
@@ -1529,7 +2676,7 @@
     <w:p>
       <w:r>
         <w:pict w14:anchorId="6943B8E3">
-          <v:rect id="_x0000_i1582" style="width:0;height:1.5pt" o:hralign="center" o:hrstd="t" o:hr="t" fillcolor="#a0a0a0" stroked="f"/>
+          <v:rect id="_x0000_i1034" style="width:0;height:1.5pt" o:hralign="center" o:hrstd="t" o:hr="t" fillcolor="#a0a0a0" stroked="f"/>
         </w:pict>
       </w:r>
     </w:p>
@@ -1627,7 +2774,7 @@
     <w:p>
       <w:r>
         <w:pict w14:anchorId="6618BC85">
-          <v:rect id="_x0000_i1583" style="width:0;height:1.5pt" o:hralign="center" o:hrstd="t" o:hr="t" fillcolor="#a0a0a0" stroked="f"/>
+          <v:rect id="_x0000_i1035" style="width:0;height:1.5pt" o:hralign="center" o:hrstd="t" o:hr="t" fillcolor="#a0a0a0" stroked="f"/>
         </w:pict>
       </w:r>
     </w:p>
@@ -1725,7 +2872,7 @@
     <w:p>
       <w:r>
         <w:pict w14:anchorId="5E053546">
-          <v:rect id="_x0000_i1584" style="width:0;height:1.5pt" o:hralign="center" o:hrstd="t" o:hr="t" fillcolor="#a0a0a0" stroked="f"/>
+          <v:rect id="_x0000_i1036" style="width:0;height:1.5pt" o:hralign="center" o:hrstd="t" o:hr="t" fillcolor="#a0a0a0" stroked="f"/>
         </w:pict>
       </w:r>
     </w:p>
@@ -1839,7 +2986,7 @@
     <w:p>
       <w:r>
         <w:pict w14:anchorId="08D99B0B">
-          <v:rect id="_x0000_i1585" style="width:0;height:1.5pt" o:hralign="center" o:hrstd="t" o:hr="t" fillcolor="#a0a0a0" stroked="f"/>
+          <v:rect id="_x0000_i1037" style="width:0;height:1.5pt" o:hralign="center" o:hrstd="t" o:hr="t" fillcolor="#a0a0a0" stroked="f"/>
         </w:pict>
       </w:r>
     </w:p>
@@ -1937,7 +3084,7 @@
     <w:p>
       <w:r>
         <w:pict w14:anchorId="1F1DBBF5">
-          <v:rect id="_x0000_i1586" style="width:0;height:1.5pt" o:hralign="center" o:hrstd="t" o:hr="t" fillcolor="#a0a0a0" stroked="f"/>
+          <v:rect id="_x0000_i1038" style="width:0;height:1.5pt" o:hralign="center" o:hrstd="t" o:hr="t" fillcolor="#a0a0a0" stroked="f"/>
         </w:pict>
       </w:r>
     </w:p>
@@ -2035,7 +3182,7 @@
     <w:p>
       <w:r>
         <w:pict w14:anchorId="52C05A01">
-          <v:rect id="_x0000_i1587" style="width:0;height:1.5pt" o:hralign="center" o:hrstd="t" o:hr="t" fillcolor="#a0a0a0" stroked="f"/>
+          <v:rect id="_x0000_i1039" style="width:0;height:1.5pt" o:hralign="center" o:hrstd="t" o:hr="t" fillcolor="#a0a0a0" stroked="f"/>
         </w:pict>
       </w:r>
     </w:p>
@@ -2141,7 +3288,7 @@
     <w:p>
       <w:r>
         <w:pict w14:anchorId="3849B473">
-          <v:rect id="_x0000_i1588" style="width:0;height:1.5pt" o:hralign="center" o:hrstd="t" o:hr="t" fillcolor="#a0a0a0" stroked="f"/>
+          <v:rect id="_x0000_i1040" style="width:0;height:1.5pt" o:hralign="center" o:hrstd="t" o:hr="t" fillcolor="#a0a0a0" stroked="f"/>
         </w:pict>
       </w:r>
     </w:p>
@@ -2239,7 +3386,7 @@
     <w:p>
       <w:r>
         <w:pict w14:anchorId="7E9C82AE">
-          <v:rect id="_x0000_i1589" style="width:0;height:1.5pt" o:hralign="center" o:hrstd="t" o:hr="t" fillcolor="#a0a0a0" stroked="f"/>
+          <v:rect id="_x0000_i1041" style="width:0;height:1.5pt" o:hralign="center" o:hrstd="t" o:hr="t" fillcolor="#a0a0a0" stroked="f"/>
         </w:pict>
       </w:r>
     </w:p>
@@ -2345,7 +3492,7 @@
     <w:p>
       <w:r>
         <w:pict w14:anchorId="554E446C">
-          <v:rect id="_x0000_i1590" style="width:0;height:1.5pt" o:hralign="center" o:hrstd="t" o:hr="t" fillcolor="#a0a0a0" stroked="f"/>
+          <v:rect id="_x0000_i1042" style="width:0;height:1.5pt" o:hralign="center" o:hrstd="t" o:hr="t" fillcolor="#a0a0a0" stroked="f"/>
         </w:pict>
       </w:r>
     </w:p>
@@ -2443,7 +3590,7 @@
     <w:p>
       <w:r>
         <w:pict w14:anchorId="36A3BCC6">
-          <v:rect id="_x0000_i1591" style="width:0;height:1.5pt" o:hralign="center" o:hrstd="t" o:hr="t" fillcolor="#a0a0a0" stroked="f"/>
+          <v:rect id="_x0000_i1043" style="width:0;height:1.5pt" o:hralign="center" o:hrstd="t" o:hr="t" fillcolor="#a0a0a0" stroked="f"/>
         </w:pict>
       </w:r>
     </w:p>
@@ -2541,7 +3688,7 @@
     <w:p>
       <w:r>
         <w:pict w14:anchorId="428DD417">
-          <v:rect id="_x0000_i1592" style="width:0;height:1.5pt" o:hralign="center" o:hrstd="t" o:hr="t" fillcolor="#a0a0a0" stroked="f"/>
+          <v:rect id="_x0000_i1044" style="width:0;height:1.5pt" o:hralign="center" o:hrstd="t" o:hr="t" fillcolor="#a0a0a0" stroked="f"/>
         </w:pict>
       </w:r>
     </w:p>
@@ -2644,7 +3791,7 @@
     <w:p>
       <w:r>
         <w:pict w14:anchorId="560E603A">
-          <v:rect id="_x0000_i1593" style="width:0;height:1.5pt" o:hralign="center" o:hrstd="t" o:hr="t" fillcolor="#a0a0a0" stroked="f"/>
+          <v:rect id="_x0000_i1045" style="width:0;height:1.5pt" o:hralign="center" o:hrstd="t" o:hr="t" fillcolor="#a0a0a0" stroked="f"/>
         </w:pict>
       </w:r>
     </w:p>
@@ -2742,7 +3889,7 @@
     <w:p>
       <w:r>
         <w:pict w14:anchorId="008E842A">
-          <v:rect id="_x0000_i1594" style="width:0;height:1.5pt" o:hralign="center" o:hrstd="t" o:hr="t" fillcolor="#a0a0a0" stroked="f"/>
+          <v:rect id="_x0000_i1046" style="width:0;height:1.5pt" o:hralign="center" o:hrstd="t" o:hr="t" fillcolor="#a0a0a0" stroked="f"/>
         </w:pict>
       </w:r>
     </w:p>
@@ -2856,7 +4003,7 @@
     <w:p>
       <w:r>
         <w:pict w14:anchorId="7670F2BB">
-          <v:rect id="_x0000_i1595" style="width:0;height:1.5pt" o:hralign="center" o:hrstd="t" o:hr="t" fillcolor="#a0a0a0" stroked="f"/>
+          <v:rect id="_x0000_i1047" style="width:0;height:1.5pt" o:hralign="center" o:hrstd="t" o:hr="t" fillcolor="#a0a0a0" stroked="f"/>
         </w:pict>
       </w:r>
     </w:p>
@@ -2954,7 +4101,7 @@
     <w:p>
       <w:r>
         <w:pict w14:anchorId="661CE7F8">
-          <v:rect id="_x0000_i1596" style="width:0;height:1.5pt" o:hralign="center" o:hrstd="t" o:hr="t" fillcolor="#a0a0a0" stroked="f"/>
+          <v:rect id="_x0000_i1048" style="width:0;height:1.5pt" o:hralign="center" o:hrstd="t" o:hr="t" fillcolor="#a0a0a0" stroked="f"/>
         </w:pict>
       </w:r>
     </w:p>
@@ -3069,7 +4216,7 @@
     <w:p>
       <w:r>
         <w:pict w14:anchorId="7DFBFA05">
-          <v:rect id="_x0000_i1597" style="width:0;height:1.5pt" o:hralign="center" o:hrstd="t" o:hr="t" fillcolor="#a0a0a0" stroked="f"/>
+          <v:rect id="_x0000_i1049" style="width:0;height:1.5pt" o:hralign="center" o:hrstd="t" o:hr="t" fillcolor="#a0a0a0" stroked="f"/>
         </w:pict>
       </w:r>
     </w:p>
@@ -3167,7 +4314,7 @@
     <w:p>
       <w:r>
         <w:pict w14:anchorId="46B3855B">
-          <v:rect id="_x0000_i1598" style="width:0;height:1.5pt" o:hralign="center" o:hrstd="t" o:hr="t" fillcolor="#a0a0a0" stroked="f"/>
+          <v:rect id="_x0000_i1050" style="width:0;height:1.5pt" o:hralign="center" o:hrstd="t" o:hr="t" fillcolor="#a0a0a0" stroked="f"/>
         </w:pict>
       </w:r>
     </w:p>
@@ -3281,7 +4428,7 @@
     <w:p>
       <w:r>
         <w:pict w14:anchorId="700FD17E">
-          <v:rect id="_x0000_i1599" style="width:0;height:1.5pt" o:hralign="center" o:hrstd="t" o:hr="t" fillcolor="#a0a0a0" stroked="f"/>
+          <v:rect id="_x0000_i1051" style="width:0;height:1.5pt" o:hralign="center" o:hrstd="t" o:hr="t" fillcolor="#a0a0a0" stroked="f"/>
         </w:pict>
       </w:r>
     </w:p>
@@ -3379,7 +4526,7 @@
     <w:p>
       <w:r>
         <w:pict w14:anchorId="29E4BC05">
-          <v:rect id="_x0000_i1600" style="width:0;height:1.5pt" o:hralign="center" o:hrstd="t" o:hr="t" fillcolor="#a0a0a0" stroked="f"/>
+          <v:rect id="_x0000_i1052" style="width:0;height:1.5pt" o:hralign="center" o:hrstd="t" o:hr="t" fillcolor="#a0a0a0" stroked="f"/>
         </w:pict>
       </w:r>
     </w:p>
@@ -3485,7 +4632,7 @@
     <w:p>
       <w:r>
         <w:pict w14:anchorId="470DDF5D">
-          <v:rect id="_x0000_i1601" style="width:0;height:1.5pt" o:hralign="center" o:hrstd="t" o:hr="t" fillcolor="#a0a0a0" stroked="f"/>
+          <v:rect id="_x0000_i1053" style="width:0;height:1.5pt" o:hralign="center" o:hrstd="t" o:hr="t" fillcolor="#a0a0a0" stroked="f"/>
         </w:pict>
       </w:r>
     </w:p>
@@ -3583,7 +4730,7 @@
     <w:p>
       <w:r>
         <w:pict w14:anchorId="7A3EBA90">
-          <v:rect id="_x0000_i1602" style="width:0;height:1.5pt" o:hralign="center" o:hrstd="t" o:hr="t" fillcolor="#a0a0a0" stroked="f"/>
+          <v:rect id="_x0000_i1054" style="width:0;height:1.5pt" o:hralign="center" o:hrstd="t" o:hr="t" fillcolor="#a0a0a0" stroked="f"/>
         </w:pict>
       </w:r>
     </w:p>
@@ -3681,7 +4828,7 @@
     <w:p>
       <w:r>
         <w:pict w14:anchorId="538826F7">
-          <v:rect id="_x0000_i1603" style="width:0;height:1.5pt" o:hralign="center" o:hrstd="t" o:hr="t" fillcolor="#a0a0a0" stroked="f"/>
+          <v:rect id="_x0000_i1055" style="width:0;height:1.5pt" o:hralign="center" o:hrstd="t" o:hr="t" fillcolor="#a0a0a0" stroked="f"/>
         </w:pict>
       </w:r>
     </w:p>
@@ -4464,6 +5611,155 @@
     </w:lvl>
   </w:abstractNum>
   <w:abstractNum w:abstractNumId="5" w15:restartNumberingAfterBreak="0">
+    <w:nsid w:val="0B0315C9"/>
+    <w:multiLevelType w:val="multilevel"/>
+    <w:tmpl w:val="D5F492B8"/>
+    <w:lvl w:ilvl="0">
+      <w:start w:val="1"/>
+      <w:numFmt w:val="bullet"/>
+      <w:lvlText w:val=""/>
+      <w:lvlJc w:val="left"/>
+      <w:pPr>
+        <w:tabs>
+          <w:tab w:val="num" w:pos="720"/>
+        </w:tabs>
+        <w:ind w:left="720" w:hanging="360"/>
+      </w:pPr>
+      <w:rPr>
+        <w:rFonts w:ascii="Symbol" w:hAnsi="Symbol" w:hint="default"/>
+        <w:sz w:val="20"/>
+      </w:rPr>
+    </w:lvl>
+    <w:lvl w:ilvl="1" w:tentative="1">
+      <w:start w:val="1"/>
+      <w:numFmt w:val="bullet"/>
+      <w:lvlText w:val="o"/>
+      <w:lvlJc w:val="left"/>
+      <w:pPr>
+        <w:tabs>
+          <w:tab w:val="num" w:pos="1440"/>
+        </w:tabs>
+        <w:ind w:left="1440" w:hanging="360"/>
+      </w:pPr>
+      <w:rPr>
+        <w:rFonts w:ascii="Courier New" w:hAnsi="Courier New" w:hint="default"/>
+        <w:sz w:val="20"/>
+      </w:rPr>
+    </w:lvl>
+    <w:lvl w:ilvl="2" w:tentative="1">
+      <w:start w:val="1"/>
+      <w:numFmt w:val="bullet"/>
+      <w:lvlText w:val=""/>
+      <w:lvlJc w:val="left"/>
+      <w:pPr>
+        <w:tabs>
+          <w:tab w:val="num" w:pos="2160"/>
+        </w:tabs>
+        <w:ind w:left="2160" w:hanging="360"/>
+      </w:pPr>
+      <w:rPr>
+        <w:rFonts w:ascii="Wingdings" w:hAnsi="Wingdings" w:hint="default"/>
+        <w:sz w:val="20"/>
+      </w:rPr>
+    </w:lvl>
+    <w:lvl w:ilvl="3" w:tentative="1">
+      <w:start w:val="1"/>
+      <w:numFmt w:val="bullet"/>
+      <w:lvlText w:val=""/>
+      <w:lvlJc w:val="left"/>
+      <w:pPr>
+        <w:tabs>
+          <w:tab w:val="num" w:pos="2880"/>
+        </w:tabs>
+        <w:ind w:left="2880" w:hanging="360"/>
+      </w:pPr>
+      <w:rPr>
+        <w:rFonts w:ascii="Wingdings" w:hAnsi="Wingdings" w:hint="default"/>
+        <w:sz w:val="20"/>
+      </w:rPr>
+    </w:lvl>
+    <w:lvl w:ilvl="4" w:tentative="1">
+      <w:start w:val="1"/>
+      <w:numFmt w:val="bullet"/>
+      <w:lvlText w:val=""/>
+      <w:lvlJc w:val="left"/>
+      <w:pPr>
+        <w:tabs>
+          <w:tab w:val="num" w:pos="3600"/>
+        </w:tabs>
+        <w:ind w:left="3600" w:hanging="360"/>
+      </w:pPr>
+      <w:rPr>
+        <w:rFonts w:ascii="Wingdings" w:hAnsi="Wingdings" w:hint="default"/>
+        <w:sz w:val="20"/>
+      </w:rPr>
+    </w:lvl>
+    <w:lvl w:ilvl="5" w:tentative="1">
+      <w:start w:val="1"/>
+      <w:numFmt w:val="bullet"/>
+      <w:lvlText w:val=""/>
+      <w:lvlJc w:val="left"/>
+      <w:pPr>
+        <w:tabs>
+          <w:tab w:val="num" w:pos="4320"/>
+        </w:tabs>
+        <w:ind w:left="4320" w:hanging="360"/>
+      </w:pPr>
+      <w:rPr>
+        <w:rFonts w:ascii="Wingdings" w:hAnsi="Wingdings" w:hint="default"/>
+        <w:sz w:val="20"/>
+      </w:rPr>
+    </w:lvl>
+    <w:lvl w:ilvl="6" w:tentative="1">
+      <w:start w:val="1"/>
+      <w:numFmt w:val="bullet"/>
+      <w:lvlText w:val=""/>
+      <w:lvlJc w:val="left"/>
+      <w:pPr>
+        <w:tabs>
+          <w:tab w:val="num" w:pos="5040"/>
+        </w:tabs>
+        <w:ind w:left="5040" w:hanging="360"/>
+      </w:pPr>
+      <w:rPr>
+        <w:rFonts w:ascii="Wingdings" w:hAnsi="Wingdings" w:hint="default"/>
+        <w:sz w:val="20"/>
+      </w:rPr>
+    </w:lvl>
+    <w:lvl w:ilvl="7" w:tentative="1">
+      <w:start w:val="1"/>
+      <w:numFmt w:val="bullet"/>
+      <w:lvlText w:val=""/>
+      <w:lvlJc w:val="left"/>
+      <w:pPr>
+        <w:tabs>
+          <w:tab w:val="num" w:pos="5760"/>
+        </w:tabs>
+        <w:ind w:left="5760" w:hanging="360"/>
+      </w:pPr>
+      <w:rPr>
+        <w:rFonts w:ascii="Wingdings" w:hAnsi="Wingdings" w:hint="default"/>
+        <w:sz w:val="20"/>
+      </w:rPr>
+    </w:lvl>
+    <w:lvl w:ilvl="8" w:tentative="1">
+      <w:start w:val="1"/>
+      <w:numFmt w:val="bullet"/>
+      <w:lvlText w:val=""/>
+      <w:lvlJc w:val="left"/>
+      <w:pPr>
+        <w:tabs>
+          <w:tab w:val="num" w:pos="6480"/>
+        </w:tabs>
+        <w:ind w:left="6480" w:hanging="360"/>
+      </w:pPr>
+      <w:rPr>
+        <w:rFonts w:ascii="Wingdings" w:hAnsi="Wingdings" w:hint="default"/>
+        <w:sz w:val="20"/>
+      </w:rPr>
+    </w:lvl>
+  </w:abstractNum>
+  <w:abstractNum w:abstractNumId="6" w15:restartNumberingAfterBreak="0">
     <w:nsid w:val="12307718"/>
     <w:multiLevelType w:val="multilevel"/>
     <w:tmpl w:val="610204AE"/>
@@ -4612,7 +5908,156 @@
       </w:rPr>
     </w:lvl>
   </w:abstractNum>
-  <w:abstractNum w:abstractNumId="6" w15:restartNumberingAfterBreak="0">
+  <w:abstractNum w:abstractNumId="7" w15:restartNumberingAfterBreak="0">
+    <w:nsid w:val="15AB6FF4"/>
+    <w:multiLevelType w:val="multilevel"/>
+    <w:tmpl w:val="78D02B38"/>
+    <w:lvl w:ilvl="0">
+      <w:start w:val="1"/>
+      <w:numFmt w:val="bullet"/>
+      <w:lvlText w:val=""/>
+      <w:lvlJc w:val="left"/>
+      <w:pPr>
+        <w:tabs>
+          <w:tab w:val="num" w:pos="720"/>
+        </w:tabs>
+        <w:ind w:left="720" w:hanging="360"/>
+      </w:pPr>
+      <w:rPr>
+        <w:rFonts w:ascii="Symbol" w:hAnsi="Symbol" w:hint="default"/>
+        <w:sz w:val="20"/>
+      </w:rPr>
+    </w:lvl>
+    <w:lvl w:ilvl="1">
+      <w:start w:val="1"/>
+      <w:numFmt w:val="bullet"/>
+      <w:lvlText w:val="o"/>
+      <w:lvlJc w:val="left"/>
+      <w:pPr>
+        <w:tabs>
+          <w:tab w:val="num" w:pos="1440"/>
+        </w:tabs>
+        <w:ind w:left="1440" w:hanging="360"/>
+      </w:pPr>
+      <w:rPr>
+        <w:rFonts w:ascii="Courier New" w:hAnsi="Courier New" w:hint="default"/>
+        <w:sz w:val="20"/>
+      </w:rPr>
+    </w:lvl>
+    <w:lvl w:ilvl="2" w:tentative="1">
+      <w:start w:val="1"/>
+      <w:numFmt w:val="bullet"/>
+      <w:lvlText w:val=""/>
+      <w:lvlJc w:val="left"/>
+      <w:pPr>
+        <w:tabs>
+          <w:tab w:val="num" w:pos="2160"/>
+        </w:tabs>
+        <w:ind w:left="2160" w:hanging="360"/>
+      </w:pPr>
+      <w:rPr>
+        <w:rFonts w:ascii="Wingdings" w:hAnsi="Wingdings" w:hint="default"/>
+        <w:sz w:val="20"/>
+      </w:rPr>
+    </w:lvl>
+    <w:lvl w:ilvl="3" w:tentative="1">
+      <w:start w:val="1"/>
+      <w:numFmt w:val="bullet"/>
+      <w:lvlText w:val=""/>
+      <w:lvlJc w:val="left"/>
+      <w:pPr>
+        <w:tabs>
+          <w:tab w:val="num" w:pos="2880"/>
+        </w:tabs>
+        <w:ind w:left="2880" w:hanging="360"/>
+      </w:pPr>
+      <w:rPr>
+        <w:rFonts w:ascii="Wingdings" w:hAnsi="Wingdings" w:hint="default"/>
+        <w:sz w:val="20"/>
+      </w:rPr>
+    </w:lvl>
+    <w:lvl w:ilvl="4" w:tentative="1">
+      <w:start w:val="1"/>
+      <w:numFmt w:val="bullet"/>
+      <w:lvlText w:val=""/>
+      <w:lvlJc w:val="left"/>
+      <w:pPr>
+        <w:tabs>
+          <w:tab w:val="num" w:pos="3600"/>
+        </w:tabs>
+        <w:ind w:left="3600" w:hanging="360"/>
+      </w:pPr>
+      <w:rPr>
+        <w:rFonts w:ascii="Wingdings" w:hAnsi="Wingdings" w:hint="default"/>
+        <w:sz w:val="20"/>
+      </w:rPr>
+    </w:lvl>
+    <w:lvl w:ilvl="5" w:tentative="1">
+      <w:start w:val="1"/>
+      <w:numFmt w:val="bullet"/>
+      <w:lvlText w:val=""/>
+      <w:lvlJc w:val="left"/>
+      <w:pPr>
+        <w:tabs>
+          <w:tab w:val="num" w:pos="4320"/>
+        </w:tabs>
+        <w:ind w:left="4320" w:hanging="360"/>
+      </w:pPr>
+      <w:rPr>
+        <w:rFonts w:ascii="Wingdings" w:hAnsi="Wingdings" w:hint="default"/>
+        <w:sz w:val="20"/>
+      </w:rPr>
+    </w:lvl>
+    <w:lvl w:ilvl="6" w:tentative="1">
+      <w:start w:val="1"/>
+      <w:numFmt w:val="bullet"/>
+      <w:lvlText w:val=""/>
+      <w:lvlJc w:val="left"/>
+      <w:pPr>
+        <w:tabs>
+          <w:tab w:val="num" w:pos="5040"/>
+        </w:tabs>
+        <w:ind w:left="5040" w:hanging="360"/>
+      </w:pPr>
+      <w:rPr>
+        <w:rFonts w:ascii="Wingdings" w:hAnsi="Wingdings" w:hint="default"/>
+        <w:sz w:val="20"/>
+      </w:rPr>
+    </w:lvl>
+    <w:lvl w:ilvl="7" w:tentative="1">
+      <w:start w:val="1"/>
+      <w:numFmt w:val="bullet"/>
+      <w:lvlText w:val=""/>
+      <w:lvlJc w:val="left"/>
+      <w:pPr>
+        <w:tabs>
+          <w:tab w:val="num" w:pos="5760"/>
+        </w:tabs>
+        <w:ind w:left="5760" w:hanging="360"/>
+      </w:pPr>
+      <w:rPr>
+        <w:rFonts w:ascii="Wingdings" w:hAnsi="Wingdings" w:hint="default"/>
+        <w:sz w:val="20"/>
+      </w:rPr>
+    </w:lvl>
+    <w:lvl w:ilvl="8" w:tentative="1">
+      <w:start w:val="1"/>
+      <w:numFmt w:val="bullet"/>
+      <w:lvlText w:val=""/>
+      <w:lvlJc w:val="left"/>
+      <w:pPr>
+        <w:tabs>
+          <w:tab w:val="num" w:pos="6480"/>
+        </w:tabs>
+        <w:ind w:left="6480" w:hanging="360"/>
+      </w:pPr>
+      <w:rPr>
+        <w:rFonts w:ascii="Wingdings" w:hAnsi="Wingdings" w:hint="default"/>
+        <w:sz w:val="20"/>
+      </w:rPr>
+    </w:lvl>
+  </w:abstractNum>
+  <w:abstractNum w:abstractNumId="8" w15:restartNumberingAfterBreak="0">
     <w:nsid w:val="166F4C4A"/>
     <w:multiLevelType w:val="multilevel"/>
     <w:tmpl w:val="02E6861C"/>
@@ -4761,7 +6206,156 @@
       </w:rPr>
     </w:lvl>
   </w:abstractNum>
-  <w:abstractNum w:abstractNumId="7" w15:restartNumberingAfterBreak="0">
+  <w:abstractNum w:abstractNumId="9" w15:restartNumberingAfterBreak="0">
+    <w:nsid w:val="189B2419"/>
+    <w:multiLevelType w:val="multilevel"/>
+    <w:tmpl w:val="F83CCF74"/>
+    <w:lvl w:ilvl="0">
+      <w:start w:val="1"/>
+      <w:numFmt w:val="bullet"/>
+      <w:lvlText w:val=""/>
+      <w:lvlJc w:val="left"/>
+      <w:pPr>
+        <w:tabs>
+          <w:tab w:val="num" w:pos="720"/>
+        </w:tabs>
+        <w:ind w:left="720" w:hanging="360"/>
+      </w:pPr>
+      <w:rPr>
+        <w:rFonts w:ascii="Symbol" w:hAnsi="Symbol" w:hint="default"/>
+        <w:sz w:val="20"/>
+      </w:rPr>
+    </w:lvl>
+    <w:lvl w:ilvl="1" w:tentative="1">
+      <w:start w:val="1"/>
+      <w:numFmt w:val="bullet"/>
+      <w:lvlText w:val="o"/>
+      <w:lvlJc w:val="left"/>
+      <w:pPr>
+        <w:tabs>
+          <w:tab w:val="num" w:pos="1440"/>
+        </w:tabs>
+        <w:ind w:left="1440" w:hanging="360"/>
+      </w:pPr>
+      <w:rPr>
+        <w:rFonts w:ascii="Courier New" w:hAnsi="Courier New" w:hint="default"/>
+        <w:sz w:val="20"/>
+      </w:rPr>
+    </w:lvl>
+    <w:lvl w:ilvl="2" w:tentative="1">
+      <w:start w:val="1"/>
+      <w:numFmt w:val="bullet"/>
+      <w:lvlText w:val=""/>
+      <w:lvlJc w:val="left"/>
+      <w:pPr>
+        <w:tabs>
+          <w:tab w:val="num" w:pos="2160"/>
+        </w:tabs>
+        <w:ind w:left="2160" w:hanging="360"/>
+      </w:pPr>
+      <w:rPr>
+        <w:rFonts w:ascii="Wingdings" w:hAnsi="Wingdings" w:hint="default"/>
+        <w:sz w:val="20"/>
+      </w:rPr>
+    </w:lvl>
+    <w:lvl w:ilvl="3" w:tentative="1">
+      <w:start w:val="1"/>
+      <w:numFmt w:val="bullet"/>
+      <w:lvlText w:val=""/>
+      <w:lvlJc w:val="left"/>
+      <w:pPr>
+        <w:tabs>
+          <w:tab w:val="num" w:pos="2880"/>
+        </w:tabs>
+        <w:ind w:left="2880" w:hanging="360"/>
+      </w:pPr>
+      <w:rPr>
+        <w:rFonts w:ascii="Wingdings" w:hAnsi="Wingdings" w:hint="default"/>
+        <w:sz w:val="20"/>
+      </w:rPr>
+    </w:lvl>
+    <w:lvl w:ilvl="4" w:tentative="1">
+      <w:start w:val="1"/>
+      <w:numFmt w:val="bullet"/>
+      <w:lvlText w:val=""/>
+      <w:lvlJc w:val="left"/>
+      <w:pPr>
+        <w:tabs>
+          <w:tab w:val="num" w:pos="3600"/>
+        </w:tabs>
+        <w:ind w:left="3600" w:hanging="360"/>
+      </w:pPr>
+      <w:rPr>
+        <w:rFonts w:ascii="Wingdings" w:hAnsi="Wingdings" w:hint="default"/>
+        <w:sz w:val="20"/>
+      </w:rPr>
+    </w:lvl>
+    <w:lvl w:ilvl="5" w:tentative="1">
+      <w:start w:val="1"/>
+      <w:numFmt w:val="bullet"/>
+      <w:lvlText w:val=""/>
+      <w:lvlJc w:val="left"/>
+      <w:pPr>
+        <w:tabs>
+          <w:tab w:val="num" w:pos="4320"/>
+        </w:tabs>
+        <w:ind w:left="4320" w:hanging="360"/>
+      </w:pPr>
+      <w:rPr>
+        <w:rFonts w:ascii="Wingdings" w:hAnsi="Wingdings" w:hint="default"/>
+        <w:sz w:val="20"/>
+      </w:rPr>
+    </w:lvl>
+    <w:lvl w:ilvl="6" w:tentative="1">
+      <w:start w:val="1"/>
+      <w:numFmt w:val="bullet"/>
+      <w:lvlText w:val=""/>
+      <w:lvlJc w:val="left"/>
+      <w:pPr>
+        <w:tabs>
+          <w:tab w:val="num" w:pos="5040"/>
+        </w:tabs>
+        <w:ind w:left="5040" w:hanging="360"/>
+      </w:pPr>
+      <w:rPr>
+        <w:rFonts w:ascii="Wingdings" w:hAnsi="Wingdings" w:hint="default"/>
+        <w:sz w:val="20"/>
+      </w:rPr>
+    </w:lvl>
+    <w:lvl w:ilvl="7" w:tentative="1">
+      <w:start w:val="1"/>
+      <w:numFmt w:val="bullet"/>
+      <w:lvlText w:val=""/>
+      <w:lvlJc w:val="left"/>
+      <w:pPr>
+        <w:tabs>
+          <w:tab w:val="num" w:pos="5760"/>
+        </w:tabs>
+        <w:ind w:left="5760" w:hanging="360"/>
+      </w:pPr>
+      <w:rPr>
+        <w:rFonts w:ascii="Wingdings" w:hAnsi="Wingdings" w:hint="default"/>
+        <w:sz w:val="20"/>
+      </w:rPr>
+    </w:lvl>
+    <w:lvl w:ilvl="8" w:tentative="1">
+      <w:start w:val="1"/>
+      <w:numFmt w:val="bullet"/>
+      <w:lvlText w:val=""/>
+      <w:lvlJc w:val="left"/>
+      <w:pPr>
+        <w:tabs>
+          <w:tab w:val="num" w:pos="6480"/>
+        </w:tabs>
+        <w:ind w:left="6480" w:hanging="360"/>
+      </w:pPr>
+      <w:rPr>
+        <w:rFonts w:ascii="Wingdings" w:hAnsi="Wingdings" w:hint="default"/>
+        <w:sz w:val="20"/>
+      </w:rPr>
+    </w:lvl>
+  </w:abstractNum>
+  <w:abstractNum w:abstractNumId="10" w15:restartNumberingAfterBreak="0">
     <w:nsid w:val="19114E11"/>
     <w:multiLevelType w:val="multilevel"/>
     <w:tmpl w:val="3E441A34"/>
@@ -4910,7 +6504,7 @@
       </w:rPr>
     </w:lvl>
   </w:abstractNum>
-  <w:abstractNum w:abstractNumId="8" w15:restartNumberingAfterBreak="0">
+  <w:abstractNum w:abstractNumId="11" w15:restartNumberingAfterBreak="0">
     <w:nsid w:val="194058C9"/>
     <w:multiLevelType w:val="multilevel"/>
     <w:tmpl w:val="B0DC5442"/>
@@ -5059,7 +6653,156 @@
       </w:rPr>
     </w:lvl>
   </w:abstractNum>
-  <w:abstractNum w:abstractNumId="9" w15:restartNumberingAfterBreak="0">
+  <w:abstractNum w:abstractNumId="12" w15:restartNumberingAfterBreak="0">
+    <w:nsid w:val="19E763F8"/>
+    <w:multiLevelType w:val="multilevel"/>
+    <w:tmpl w:val="E7067F6E"/>
+    <w:lvl w:ilvl="0">
+      <w:start w:val="1"/>
+      <w:numFmt w:val="bullet"/>
+      <w:lvlText w:val=""/>
+      <w:lvlJc w:val="left"/>
+      <w:pPr>
+        <w:tabs>
+          <w:tab w:val="num" w:pos="720"/>
+        </w:tabs>
+        <w:ind w:left="720" w:hanging="360"/>
+      </w:pPr>
+      <w:rPr>
+        <w:rFonts w:ascii="Symbol" w:hAnsi="Symbol" w:hint="default"/>
+        <w:sz w:val="20"/>
+      </w:rPr>
+    </w:lvl>
+    <w:lvl w:ilvl="1">
+      <w:start w:val="1"/>
+      <w:numFmt w:val="bullet"/>
+      <w:lvlText w:val="o"/>
+      <w:lvlJc w:val="left"/>
+      <w:pPr>
+        <w:tabs>
+          <w:tab w:val="num" w:pos="1440"/>
+        </w:tabs>
+        <w:ind w:left="1440" w:hanging="360"/>
+      </w:pPr>
+      <w:rPr>
+        <w:rFonts w:ascii="Courier New" w:hAnsi="Courier New" w:hint="default"/>
+        <w:sz w:val="20"/>
+      </w:rPr>
+    </w:lvl>
+    <w:lvl w:ilvl="2" w:tentative="1">
+      <w:start w:val="1"/>
+      <w:numFmt w:val="bullet"/>
+      <w:lvlText w:val=""/>
+      <w:lvlJc w:val="left"/>
+      <w:pPr>
+        <w:tabs>
+          <w:tab w:val="num" w:pos="2160"/>
+        </w:tabs>
+        <w:ind w:left="2160" w:hanging="360"/>
+      </w:pPr>
+      <w:rPr>
+        <w:rFonts w:ascii="Wingdings" w:hAnsi="Wingdings" w:hint="default"/>
+        <w:sz w:val="20"/>
+      </w:rPr>
+    </w:lvl>
+    <w:lvl w:ilvl="3" w:tentative="1">
+      <w:start w:val="1"/>
+      <w:numFmt w:val="bullet"/>
+      <w:lvlText w:val=""/>
+      <w:lvlJc w:val="left"/>
+      <w:pPr>
+        <w:tabs>
+          <w:tab w:val="num" w:pos="2880"/>
+        </w:tabs>
+        <w:ind w:left="2880" w:hanging="360"/>
+      </w:pPr>
+      <w:rPr>
+        <w:rFonts w:ascii="Wingdings" w:hAnsi="Wingdings" w:hint="default"/>
+        <w:sz w:val="20"/>
+      </w:rPr>
+    </w:lvl>
+    <w:lvl w:ilvl="4" w:tentative="1">
+      <w:start w:val="1"/>
+      <w:numFmt w:val="bullet"/>
+      <w:lvlText w:val=""/>
+      <w:lvlJc w:val="left"/>
+      <w:pPr>
+        <w:tabs>
+          <w:tab w:val="num" w:pos="3600"/>
+        </w:tabs>
+        <w:ind w:left="3600" w:hanging="360"/>
+      </w:pPr>
+      <w:rPr>
+        <w:rFonts w:ascii="Wingdings" w:hAnsi="Wingdings" w:hint="default"/>
+        <w:sz w:val="20"/>
+      </w:rPr>
+    </w:lvl>
+    <w:lvl w:ilvl="5" w:tentative="1">
+      <w:start w:val="1"/>
+      <w:numFmt w:val="bullet"/>
+      <w:lvlText w:val=""/>
+      <w:lvlJc w:val="left"/>
+      <w:pPr>
+        <w:tabs>
+          <w:tab w:val="num" w:pos="4320"/>
+        </w:tabs>
+        <w:ind w:left="4320" w:hanging="360"/>
+      </w:pPr>
+      <w:rPr>
+        <w:rFonts w:ascii="Wingdings" w:hAnsi="Wingdings" w:hint="default"/>
+        <w:sz w:val="20"/>
+      </w:rPr>
+    </w:lvl>
+    <w:lvl w:ilvl="6" w:tentative="1">
+      <w:start w:val="1"/>
+      <w:numFmt w:val="bullet"/>
+      <w:lvlText w:val=""/>
+      <w:lvlJc w:val="left"/>
+      <w:pPr>
+        <w:tabs>
+          <w:tab w:val="num" w:pos="5040"/>
+        </w:tabs>
+        <w:ind w:left="5040" w:hanging="360"/>
+      </w:pPr>
+      <w:rPr>
+        <w:rFonts w:ascii="Wingdings" w:hAnsi="Wingdings" w:hint="default"/>
+        <w:sz w:val="20"/>
+      </w:rPr>
+    </w:lvl>
+    <w:lvl w:ilvl="7" w:tentative="1">
+      <w:start w:val="1"/>
+      <w:numFmt w:val="bullet"/>
+      <w:lvlText w:val=""/>
+      <w:lvlJc w:val="left"/>
+      <w:pPr>
+        <w:tabs>
+          <w:tab w:val="num" w:pos="5760"/>
+        </w:tabs>
+        <w:ind w:left="5760" w:hanging="360"/>
+      </w:pPr>
+      <w:rPr>
+        <w:rFonts w:ascii="Wingdings" w:hAnsi="Wingdings" w:hint="default"/>
+        <w:sz w:val="20"/>
+      </w:rPr>
+    </w:lvl>
+    <w:lvl w:ilvl="8" w:tentative="1">
+      <w:start w:val="1"/>
+      <w:numFmt w:val="bullet"/>
+      <w:lvlText w:val=""/>
+      <w:lvlJc w:val="left"/>
+      <w:pPr>
+        <w:tabs>
+          <w:tab w:val="num" w:pos="6480"/>
+        </w:tabs>
+        <w:ind w:left="6480" w:hanging="360"/>
+      </w:pPr>
+      <w:rPr>
+        <w:rFonts w:ascii="Wingdings" w:hAnsi="Wingdings" w:hint="default"/>
+        <w:sz w:val="20"/>
+      </w:rPr>
+    </w:lvl>
+  </w:abstractNum>
+  <w:abstractNum w:abstractNumId="13" w15:restartNumberingAfterBreak="0">
     <w:nsid w:val="1A8F24C4"/>
     <w:multiLevelType w:val="multilevel"/>
     <w:tmpl w:val="75B29E6A"/>
@@ -5172,7 +6915,7 @@
       </w:pPr>
     </w:lvl>
   </w:abstractNum>
-  <w:abstractNum w:abstractNumId="10" w15:restartNumberingAfterBreak="0">
+  <w:abstractNum w:abstractNumId="14" w15:restartNumberingAfterBreak="0">
     <w:nsid w:val="1AA1446A"/>
     <w:multiLevelType w:val="multilevel"/>
     <w:tmpl w:val="9320A0AC"/>
@@ -5321,7 +7064,7 @@
       </w:rPr>
     </w:lvl>
   </w:abstractNum>
-  <w:abstractNum w:abstractNumId="11" w15:restartNumberingAfterBreak="0">
+  <w:abstractNum w:abstractNumId="15" w15:restartNumberingAfterBreak="0">
     <w:nsid w:val="1D922C3B"/>
     <w:multiLevelType w:val="multilevel"/>
     <w:tmpl w:val="36D268A8"/>
@@ -5434,7 +7177,7 @@
       </w:pPr>
     </w:lvl>
   </w:abstractNum>
-  <w:abstractNum w:abstractNumId="12" w15:restartNumberingAfterBreak="0">
+  <w:abstractNum w:abstractNumId="16" w15:restartNumberingAfterBreak="0">
     <w:nsid w:val="21FA2810"/>
     <w:multiLevelType w:val="multilevel"/>
     <w:tmpl w:val="4062852C"/>
@@ -5583,7 +7326,7 @@
       </w:rPr>
     </w:lvl>
   </w:abstractNum>
-  <w:abstractNum w:abstractNumId="13" w15:restartNumberingAfterBreak="0">
+  <w:abstractNum w:abstractNumId="17" w15:restartNumberingAfterBreak="0">
     <w:nsid w:val="25427FFB"/>
     <w:multiLevelType w:val="multilevel"/>
     <w:tmpl w:val="499EBBF2"/>
@@ -5696,7 +7439,7 @@
       </w:pPr>
     </w:lvl>
   </w:abstractNum>
-  <w:abstractNum w:abstractNumId="14" w15:restartNumberingAfterBreak="0">
+  <w:abstractNum w:abstractNumId="18" w15:restartNumberingAfterBreak="0">
     <w:nsid w:val="27CB4B3E"/>
     <w:multiLevelType w:val="multilevel"/>
     <w:tmpl w:val="A01260C8"/>
@@ -5809,7 +7552,7 @@
       </w:pPr>
     </w:lvl>
   </w:abstractNum>
-  <w:abstractNum w:abstractNumId="15" w15:restartNumberingAfterBreak="0">
+  <w:abstractNum w:abstractNumId="19" w15:restartNumberingAfterBreak="0">
     <w:nsid w:val="28477117"/>
     <w:multiLevelType w:val="multilevel"/>
     <w:tmpl w:val="9E5A59F4"/>
@@ -5922,7 +7665,7 @@
       </w:pPr>
     </w:lvl>
   </w:abstractNum>
-  <w:abstractNum w:abstractNumId="16" w15:restartNumberingAfterBreak="0">
+  <w:abstractNum w:abstractNumId="20" w15:restartNumberingAfterBreak="0">
     <w:nsid w:val="2B813AF3"/>
     <w:multiLevelType w:val="multilevel"/>
     <w:tmpl w:val="93DCF062"/>
@@ -6035,7 +7778,7 @@
       </w:pPr>
     </w:lvl>
   </w:abstractNum>
-  <w:abstractNum w:abstractNumId="17" w15:restartNumberingAfterBreak="0">
+  <w:abstractNum w:abstractNumId="21" w15:restartNumberingAfterBreak="0">
     <w:nsid w:val="2C8F386D"/>
     <w:multiLevelType w:val="multilevel"/>
     <w:tmpl w:val="D652ADA4"/>
@@ -6184,7 +7927,7 @@
       </w:rPr>
     </w:lvl>
   </w:abstractNum>
-  <w:abstractNum w:abstractNumId="18" w15:restartNumberingAfterBreak="0">
+  <w:abstractNum w:abstractNumId="22" w15:restartNumberingAfterBreak="0">
     <w:nsid w:val="2DA979D7"/>
     <w:multiLevelType w:val="multilevel"/>
     <w:tmpl w:val="09647D12"/>
@@ -6297,7 +8040,7 @@
       </w:pPr>
     </w:lvl>
   </w:abstractNum>
-  <w:abstractNum w:abstractNumId="19" w15:restartNumberingAfterBreak="0">
+  <w:abstractNum w:abstractNumId="23" w15:restartNumberingAfterBreak="0">
     <w:nsid w:val="314E4525"/>
     <w:multiLevelType w:val="multilevel"/>
     <w:tmpl w:val="BF861EAE"/>
@@ -6410,7 +8153,156 @@
       </w:pPr>
     </w:lvl>
   </w:abstractNum>
-  <w:abstractNum w:abstractNumId="20" w15:restartNumberingAfterBreak="0">
+  <w:abstractNum w:abstractNumId="24" w15:restartNumberingAfterBreak="0">
+    <w:nsid w:val="32714478"/>
+    <w:multiLevelType w:val="multilevel"/>
+    <w:tmpl w:val="C632FFA4"/>
+    <w:lvl w:ilvl="0">
+      <w:start w:val="1"/>
+      <w:numFmt w:val="bullet"/>
+      <w:lvlText w:val=""/>
+      <w:lvlJc w:val="left"/>
+      <w:pPr>
+        <w:tabs>
+          <w:tab w:val="num" w:pos="720"/>
+        </w:tabs>
+        <w:ind w:left="720" w:hanging="360"/>
+      </w:pPr>
+      <w:rPr>
+        <w:rFonts w:ascii="Symbol" w:hAnsi="Symbol" w:hint="default"/>
+        <w:sz w:val="20"/>
+      </w:rPr>
+    </w:lvl>
+    <w:lvl w:ilvl="1">
+      <w:start w:val="1"/>
+      <w:numFmt w:val="bullet"/>
+      <w:lvlText w:val="o"/>
+      <w:lvlJc w:val="left"/>
+      <w:pPr>
+        <w:tabs>
+          <w:tab w:val="num" w:pos="1440"/>
+        </w:tabs>
+        <w:ind w:left="1440" w:hanging="360"/>
+      </w:pPr>
+      <w:rPr>
+        <w:rFonts w:ascii="Courier New" w:hAnsi="Courier New" w:hint="default"/>
+        <w:sz w:val="20"/>
+      </w:rPr>
+    </w:lvl>
+    <w:lvl w:ilvl="2" w:tentative="1">
+      <w:start w:val="1"/>
+      <w:numFmt w:val="bullet"/>
+      <w:lvlText w:val=""/>
+      <w:lvlJc w:val="left"/>
+      <w:pPr>
+        <w:tabs>
+          <w:tab w:val="num" w:pos="2160"/>
+        </w:tabs>
+        <w:ind w:left="2160" w:hanging="360"/>
+      </w:pPr>
+      <w:rPr>
+        <w:rFonts w:ascii="Wingdings" w:hAnsi="Wingdings" w:hint="default"/>
+        <w:sz w:val="20"/>
+      </w:rPr>
+    </w:lvl>
+    <w:lvl w:ilvl="3" w:tentative="1">
+      <w:start w:val="1"/>
+      <w:numFmt w:val="bullet"/>
+      <w:lvlText w:val=""/>
+      <w:lvlJc w:val="left"/>
+      <w:pPr>
+        <w:tabs>
+          <w:tab w:val="num" w:pos="2880"/>
+        </w:tabs>
+        <w:ind w:left="2880" w:hanging="360"/>
+      </w:pPr>
+      <w:rPr>
+        <w:rFonts w:ascii="Wingdings" w:hAnsi="Wingdings" w:hint="default"/>
+        <w:sz w:val="20"/>
+      </w:rPr>
+    </w:lvl>
+    <w:lvl w:ilvl="4" w:tentative="1">
+      <w:start w:val="1"/>
+      <w:numFmt w:val="bullet"/>
+      <w:lvlText w:val=""/>
+      <w:lvlJc w:val="left"/>
+      <w:pPr>
+        <w:tabs>
+          <w:tab w:val="num" w:pos="3600"/>
+        </w:tabs>
+        <w:ind w:left="3600" w:hanging="360"/>
+      </w:pPr>
+      <w:rPr>
+        <w:rFonts w:ascii="Wingdings" w:hAnsi="Wingdings" w:hint="default"/>
+        <w:sz w:val="20"/>
+      </w:rPr>
+    </w:lvl>
+    <w:lvl w:ilvl="5" w:tentative="1">
+      <w:start w:val="1"/>
+      <w:numFmt w:val="bullet"/>
+      <w:lvlText w:val=""/>
+      <w:lvlJc w:val="left"/>
+      <w:pPr>
+        <w:tabs>
+          <w:tab w:val="num" w:pos="4320"/>
+        </w:tabs>
+        <w:ind w:left="4320" w:hanging="360"/>
+      </w:pPr>
+      <w:rPr>
+        <w:rFonts w:ascii="Wingdings" w:hAnsi="Wingdings" w:hint="default"/>
+        <w:sz w:val="20"/>
+      </w:rPr>
+    </w:lvl>
+    <w:lvl w:ilvl="6" w:tentative="1">
+      <w:start w:val="1"/>
+      <w:numFmt w:val="bullet"/>
+      <w:lvlText w:val=""/>
+      <w:lvlJc w:val="left"/>
+      <w:pPr>
+        <w:tabs>
+          <w:tab w:val="num" w:pos="5040"/>
+        </w:tabs>
+        <w:ind w:left="5040" w:hanging="360"/>
+      </w:pPr>
+      <w:rPr>
+        <w:rFonts w:ascii="Wingdings" w:hAnsi="Wingdings" w:hint="default"/>
+        <w:sz w:val="20"/>
+      </w:rPr>
+    </w:lvl>
+    <w:lvl w:ilvl="7" w:tentative="1">
+      <w:start w:val="1"/>
+      <w:numFmt w:val="bullet"/>
+      <w:lvlText w:val=""/>
+      <w:lvlJc w:val="left"/>
+      <w:pPr>
+        <w:tabs>
+          <w:tab w:val="num" w:pos="5760"/>
+        </w:tabs>
+        <w:ind w:left="5760" w:hanging="360"/>
+      </w:pPr>
+      <w:rPr>
+        <w:rFonts w:ascii="Wingdings" w:hAnsi="Wingdings" w:hint="default"/>
+        <w:sz w:val="20"/>
+      </w:rPr>
+    </w:lvl>
+    <w:lvl w:ilvl="8" w:tentative="1">
+      <w:start w:val="1"/>
+      <w:numFmt w:val="bullet"/>
+      <w:lvlText w:val=""/>
+      <w:lvlJc w:val="left"/>
+      <w:pPr>
+        <w:tabs>
+          <w:tab w:val="num" w:pos="6480"/>
+        </w:tabs>
+        <w:ind w:left="6480" w:hanging="360"/>
+      </w:pPr>
+      <w:rPr>
+        <w:rFonts w:ascii="Wingdings" w:hAnsi="Wingdings" w:hint="default"/>
+        <w:sz w:val="20"/>
+      </w:rPr>
+    </w:lvl>
+  </w:abstractNum>
+  <w:abstractNum w:abstractNumId="25" w15:restartNumberingAfterBreak="0">
     <w:nsid w:val="35A54A67"/>
     <w:multiLevelType w:val="multilevel"/>
     <w:tmpl w:val="46E07F2A"/>
@@ -6523,7 +8415,7 @@
       </w:pPr>
     </w:lvl>
   </w:abstractNum>
-  <w:abstractNum w:abstractNumId="21" w15:restartNumberingAfterBreak="0">
+  <w:abstractNum w:abstractNumId="26" w15:restartNumberingAfterBreak="0">
     <w:nsid w:val="37740920"/>
     <w:multiLevelType w:val="multilevel"/>
     <w:tmpl w:val="9E606E3E"/>
@@ -6636,7 +8528,7 @@
       </w:pPr>
     </w:lvl>
   </w:abstractNum>
-  <w:abstractNum w:abstractNumId="22" w15:restartNumberingAfterBreak="0">
+  <w:abstractNum w:abstractNumId="27" w15:restartNumberingAfterBreak="0">
     <w:nsid w:val="384865CF"/>
     <w:multiLevelType w:val="multilevel"/>
     <w:tmpl w:val="2262522C"/>
@@ -6749,7 +8641,7 @@
       </w:pPr>
     </w:lvl>
   </w:abstractNum>
-  <w:abstractNum w:abstractNumId="23" w15:restartNumberingAfterBreak="0">
+  <w:abstractNum w:abstractNumId="28" w15:restartNumberingAfterBreak="0">
     <w:nsid w:val="38793A07"/>
     <w:multiLevelType w:val="multilevel"/>
     <w:tmpl w:val="E2241D74"/>
@@ -6898,7 +8790,7 @@
       </w:rPr>
     </w:lvl>
   </w:abstractNum>
-  <w:abstractNum w:abstractNumId="24" w15:restartNumberingAfterBreak="0">
+  <w:abstractNum w:abstractNumId="29" w15:restartNumberingAfterBreak="0">
     <w:nsid w:val="3A3B3196"/>
     <w:multiLevelType w:val="multilevel"/>
     <w:tmpl w:val="158CF550"/>
@@ -7011,7 +8903,7 @@
       </w:pPr>
     </w:lvl>
   </w:abstractNum>
-  <w:abstractNum w:abstractNumId="25" w15:restartNumberingAfterBreak="0">
+  <w:abstractNum w:abstractNumId="30" w15:restartNumberingAfterBreak="0">
     <w:nsid w:val="3ABD1670"/>
     <w:multiLevelType w:val="multilevel"/>
     <w:tmpl w:val="F41463BC"/>
@@ -7160,7 +9052,7 @@
       </w:rPr>
     </w:lvl>
   </w:abstractNum>
-  <w:abstractNum w:abstractNumId="26" w15:restartNumberingAfterBreak="0">
+  <w:abstractNum w:abstractNumId="31" w15:restartNumberingAfterBreak="0">
     <w:nsid w:val="3C8A47E8"/>
     <w:multiLevelType w:val="multilevel"/>
     <w:tmpl w:val="B46ADF28"/>
@@ -7309,7 +9201,7 @@
       </w:rPr>
     </w:lvl>
   </w:abstractNum>
-  <w:abstractNum w:abstractNumId="27" w15:restartNumberingAfterBreak="0">
+  <w:abstractNum w:abstractNumId="32" w15:restartNumberingAfterBreak="0">
     <w:nsid w:val="412E45A5"/>
     <w:multiLevelType w:val="multilevel"/>
     <w:tmpl w:val="3FAACBE6"/>
@@ -7422,7 +9314,7 @@
       </w:pPr>
     </w:lvl>
   </w:abstractNum>
-  <w:abstractNum w:abstractNumId="28" w15:restartNumberingAfterBreak="0">
+  <w:abstractNum w:abstractNumId="33" w15:restartNumberingAfterBreak="0">
     <w:nsid w:val="43957077"/>
     <w:multiLevelType w:val="multilevel"/>
     <w:tmpl w:val="8E2A619A"/>
@@ -7535,7 +9427,7 @@
       </w:pPr>
     </w:lvl>
   </w:abstractNum>
-  <w:abstractNum w:abstractNumId="29" w15:restartNumberingAfterBreak="0">
+  <w:abstractNum w:abstractNumId="34" w15:restartNumberingAfterBreak="0">
     <w:nsid w:val="46BF48D3"/>
     <w:multiLevelType w:val="multilevel"/>
     <w:tmpl w:val="28CC91C8"/>
@@ -7648,7 +9540,7 @@
       </w:pPr>
     </w:lvl>
   </w:abstractNum>
-  <w:abstractNum w:abstractNumId="30" w15:restartNumberingAfterBreak="0">
+  <w:abstractNum w:abstractNumId="35" w15:restartNumberingAfterBreak="0">
     <w:nsid w:val="484001D0"/>
     <w:multiLevelType w:val="multilevel"/>
     <w:tmpl w:val="771A973C"/>
@@ -7761,7 +9653,7 @@
       </w:pPr>
     </w:lvl>
   </w:abstractNum>
-  <w:abstractNum w:abstractNumId="31" w15:restartNumberingAfterBreak="0">
+  <w:abstractNum w:abstractNumId="36" w15:restartNumberingAfterBreak="0">
     <w:nsid w:val="499C2D65"/>
     <w:multiLevelType w:val="multilevel"/>
     <w:tmpl w:val="5784FD88"/>
@@ -7910,7 +9802,7 @@
       </w:rPr>
     </w:lvl>
   </w:abstractNum>
-  <w:abstractNum w:abstractNumId="32" w15:restartNumberingAfterBreak="0">
+  <w:abstractNum w:abstractNumId="37" w15:restartNumberingAfterBreak="0">
     <w:nsid w:val="4A4F06E0"/>
     <w:multiLevelType w:val="multilevel"/>
     <w:tmpl w:val="ED043702"/>
@@ -8059,7 +9951,156 @@
       </w:rPr>
     </w:lvl>
   </w:abstractNum>
-  <w:abstractNum w:abstractNumId="33" w15:restartNumberingAfterBreak="0">
+  <w:abstractNum w:abstractNumId="38" w15:restartNumberingAfterBreak="0">
+    <w:nsid w:val="4B176C0C"/>
+    <w:multiLevelType w:val="multilevel"/>
+    <w:tmpl w:val="A83467BE"/>
+    <w:lvl w:ilvl="0">
+      <w:start w:val="1"/>
+      <w:numFmt w:val="bullet"/>
+      <w:lvlText w:val=""/>
+      <w:lvlJc w:val="left"/>
+      <w:pPr>
+        <w:tabs>
+          <w:tab w:val="num" w:pos="720"/>
+        </w:tabs>
+        <w:ind w:left="720" w:hanging="360"/>
+      </w:pPr>
+      <w:rPr>
+        <w:rFonts w:ascii="Symbol" w:hAnsi="Symbol" w:hint="default"/>
+        <w:sz w:val="20"/>
+      </w:rPr>
+    </w:lvl>
+    <w:lvl w:ilvl="1" w:tentative="1">
+      <w:start w:val="1"/>
+      <w:numFmt w:val="bullet"/>
+      <w:lvlText w:val="o"/>
+      <w:lvlJc w:val="left"/>
+      <w:pPr>
+        <w:tabs>
+          <w:tab w:val="num" w:pos="1440"/>
+        </w:tabs>
+        <w:ind w:left="1440" w:hanging="360"/>
+      </w:pPr>
+      <w:rPr>
+        <w:rFonts w:ascii="Courier New" w:hAnsi="Courier New" w:hint="default"/>
+        <w:sz w:val="20"/>
+      </w:rPr>
+    </w:lvl>
+    <w:lvl w:ilvl="2" w:tentative="1">
+      <w:start w:val="1"/>
+      <w:numFmt w:val="bullet"/>
+      <w:lvlText w:val=""/>
+      <w:lvlJc w:val="left"/>
+      <w:pPr>
+        <w:tabs>
+          <w:tab w:val="num" w:pos="2160"/>
+        </w:tabs>
+        <w:ind w:left="2160" w:hanging="360"/>
+      </w:pPr>
+      <w:rPr>
+        <w:rFonts w:ascii="Wingdings" w:hAnsi="Wingdings" w:hint="default"/>
+        <w:sz w:val="20"/>
+      </w:rPr>
+    </w:lvl>
+    <w:lvl w:ilvl="3" w:tentative="1">
+      <w:start w:val="1"/>
+      <w:numFmt w:val="bullet"/>
+      <w:lvlText w:val=""/>
+      <w:lvlJc w:val="left"/>
+      <w:pPr>
+        <w:tabs>
+          <w:tab w:val="num" w:pos="2880"/>
+        </w:tabs>
+        <w:ind w:left="2880" w:hanging="360"/>
+      </w:pPr>
+      <w:rPr>
+        <w:rFonts w:ascii="Wingdings" w:hAnsi="Wingdings" w:hint="default"/>
+        <w:sz w:val="20"/>
+      </w:rPr>
+    </w:lvl>
+    <w:lvl w:ilvl="4" w:tentative="1">
+      <w:start w:val="1"/>
+      <w:numFmt w:val="bullet"/>
+      <w:lvlText w:val=""/>
+      <w:lvlJc w:val="left"/>
+      <w:pPr>
+        <w:tabs>
+          <w:tab w:val="num" w:pos="3600"/>
+        </w:tabs>
+        <w:ind w:left="3600" w:hanging="360"/>
+      </w:pPr>
+      <w:rPr>
+        <w:rFonts w:ascii="Wingdings" w:hAnsi="Wingdings" w:hint="default"/>
+        <w:sz w:val="20"/>
+      </w:rPr>
+    </w:lvl>
+    <w:lvl w:ilvl="5" w:tentative="1">
+      <w:start w:val="1"/>
+      <w:numFmt w:val="bullet"/>
+      <w:lvlText w:val=""/>
+      <w:lvlJc w:val="left"/>
+      <w:pPr>
+        <w:tabs>
+          <w:tab w:val="num" w:pos="4320"/>
+        </w:tabs>
+        <w:ind w:left="4320" w:hanging="360"/>
+      </w:pPr>
+      <w:rPr>
+        <w:rFonts w:ascii="Wingdings" w:hAnsi="Wingdings" w:hint="default"/>
+        <w:sz w:val="20"/>
+      </w:rPr>
+    </w:lvl>
+    <w:lvl w:ilvl="6" w:tentative="1">
+      <w:start w:val="1"/>
+      <w:numFmt w:val="bullet"/>
+      <w:lvlText w:val=""/>
+      <w:lvlJc w:val="left"/>
+      <w:pPr>
+        <w:tabs>
+          <w:tab w:val="num" w:pos="5040"/>
+        </w:tabs>
+        <w:ind w:left="5040" w:hanging="360"/>
+      </w:pPr>
+      <w:rPr>
+        <w:rFonts w:ascii="Wingdings" w:hAnsi="Wingdings" w:hint="default"/>
+        <w:sz w:val="20"/>
+      </w:rPr>
+    </w:lvl>
+    <w:lvl w:ilvl="7" w:tentative="1">
+      <w:start w:val="1"/>
+      <w:numFmt w:val="bullet"/>
+      <w:lvlText w:val=""/>
+      <w:lvlJc w:val="left"/>
+      <w:pPr>
+        <w:tabs>
+          <w:tab w:val="num" w:pos="5760"/>
+        </w:tabs>
+        <w:ind w:left="5760" w:hanging="360"/>
+      </w:pPr>
+      <w:rPr>
+        <w:rFonts w:ascii="Wingdings" w:hAnsi="Wingdings" w:hint="default"/>
+        <w:sz w:val="20"/>
+      </w:rPr>
+    </w:lvl>
+    <w:lvl w:ilvl="8" w:tentative="1">
+      <w:start w:val="1"/>
+      <w:numFmt w:val="bullet"/>
+      <w:lvlText w:val=""/>
+      <w:lvlJc w:val="left"/>
+      <w:pPr>
+        <w:tabs>
+          <w:tab w:val="num" w:pos="6480"/>
+        </w:tabs>
+        <w:ind w:left="6480" w:hanging="360"/>
+      </w:pPr>
+      <w:rPr>
+        <w:rFonts w:ascii="Wingdings" w:hAnsi="Wingdings" w:hint="default"/>
+        <w:sz w:val="20"/>
+      </w:rPr>
+    </w:lvl>
+  </w:abstractNum>
+  <w:abstractNum w:abstractNumId="39" w15:restartNumberingAfterBreak="0">
     <w:nsid w:val="4B652301"/>
     <w:multiLevelType w:val="multilevel"/>
     <w:tmpl w:val="2BAA9510"/>
@@ -8208,7 +10249,7 @@
       </w:rPr>
     </w:lvl>
   </w:abstractNum>
-  <w:abstractNum w:abstractNumId="34" w15:restartNumberingAfterBreak="0">
+  <w:abstractNum w:abstractNumId="40" w15:restartNumberingAfterBreak="0">
     <w:nsid w:val="4B763999"/>
     <w:multiLevelType w:val="multilevel"/>
     <w:tmpl w:val="C0B8E4C0"/>
@@ -8357,7 +10398,7 @@
       </w:rPr>
     </w:lvl>
   </w:abstractNum>
-  <w:abstractNum w:abstractNumId="35" w15:restartNumberingAfterBreak="0">
+  <w:abstractNum w:abstractNumId="41" w15:restartNumberingAfterBreak="0">
     <w:nsid w:val="4B7A48D8"/>
     <w:multiLevelType w:val="multilevel"/>
     <w:tmpl w:val="8774F93A"/>
@@ -8506,7 +10547,7 @@
       </w:rPr>
     </w:lvl>
   </w:abstractNum>
-  <w:abstractNum w:abstractNumId="36" w15:restartNumberingAfterBreak="0">
+  <w:abstractNum w:abstractNumId="42" w15:restartNumberingAfterBreak="0">
     <w:nsid w:val="4D2A1549"/>
     <w:multiLevelType w:val="multilevel"/>
     <w:tmpl w:val="6A62A4D0"/>
@@ -8619,7 +10660,7 @@
       </w:pPr>
     </w:lvl>
   </w:abstractNum>
-  <w:abstractNum w:abstractNumId="37" w15:restartNumberingAfterBreak="0">
+  <w:abstractNum w:abstractNumId="43" w15:restartNumberingAfterBreak="0">
     <w:nsid w:val="4ECC40DD"/>
     <w:multiLevelType w:val="multilevel"/>
     <w:tmpl w:val="5D5AA360"/>
@@ -8768,7 +10809,7 @@
       </w:rPr>
     </w:lvl>
   </w:abstractNum>
-  <w:abstractNum w:abstractNumId="38" w15:restartNumberingAfterBreak="0">
+  <w:abstractNum w:abstractNumId="44" w15:restartNumberingAfterBreak="0">
     <w:nsid w:val="4EE43F52"/>
     <w:multiLevelType w:val="multilevel"/>
     <w:tmpl w:val="BC7C95AE"/>
@@ -8881,7 +10922,7 @@
       </w:pPr>
     </w:lvl>
   </w:abstractNum>
-  <w:abstractNum w:abstractNumId="39" w15:restartNumberingAfterBreak="0">
+  <w:abstractNum w:abstractNumId="45" w15:restartNumberingAfterBreak="0">
     <w:nsid w:val="4EE610E6"/>
     <w:multiLevelType w:val="multilevel"/>
     <w:tmpl w:val="EE92DCFA"/>
@@ -9030,7 +11071,7 @@
       </w:rPr>
     </w:lvl>
   </w:abstractNum>
-  <w:abstractNum w:abstractNumId="40" w15:restartNumberingAfterBreak="0">
+  <w:abstractNum w:abstractNumId="46" w15:restartNumberingAfterBreak="0">
     <w:nsid w:val="4F2E5B8B"/>
     <w:multiLevelType w:val="multilevel"/>
     <w:tmpl w:val="3C3E6108"/>
@@ -9179,7 +11220,7 @@
       </w:rPr>
     </w:lvl>
   </w:abstractNum>
-  <w:abstractNum w:abstractNumId="41" w15:restartNumberingAfterBreak="0">
+  <w:abstractNum w:abstractNumId="47" w15:restartNumberingAfterBreak="0">
     <w:nsid w:val="51F02663"/>
     <w:multiLevelType w:val="multilevel"/>
     <w:tmpl w:val="C12A1F0E"/>
@@ -9328,7 +11369,156 @@
       </w:rPr>
     </w:lvl>
   </w:abstractNum>
-  <w:abstractNum w:abstractNumId="42" w15:restartNumberingAfterBreak="0">
+  <w:abstractNum w:abstractNumId="48" w15:restartNumberingAfterBreak="0">
+    <w:nsid w:val="5B6C7C5F"/>
+    <w:multiLevelType w:val="multilevel"/>
+    <w:tmpl w:val="1708E4A2"/>
+    <w:lvl w:ilvl="0">
+      <w:start w:val="1"/>
+      <w:numFmt w:val="bullet"/>
+      <w:lvlText w:val=""/>
+      <w:lvlJc w:val="left"/>
+      <w:pPr>
+        <w:tabs>
+          <w:tab w:val="num" w:pos="720"/>
+        </w:tabs>
+        <w:ind w:left="720" w:hanging="360"/>
+      </w:pPr>
+      <w:rPr>
+        <w:rFonts w:ascii="Symbol" w:hAnsi="Symbol" w:hint="default"/>
+        <w:sz w:val="20"/>
+      </w:rPr>
+    </w:lvl>
+    <w:lvl w:ilvl="1">
+      <w:start w:val="1"/>
+      <w:numFmt w:val="bullet"/>
+      <w:lvlText w:val="o"/>
+      <w:lvlJc w:val="left"/>
+      <w:pPr>
+        <w:tabs>
+          <w:tab w:val="num" w:pos="1440"/>
+        </w:tabs>
+        <w:ind w:left="1440" w:hanging="360"/>
+      </w:pPr>
+      <w:rPr>
+        <w:rFonts w:ascii="Courier New" w:hAnsi="Courier New" w:hint="default"/>
+        <w:sz w:val="20"/>
+      </w:rPr>
+    </w:lvl>
+    <w:lvl w:ilvl="2" w:tentative="1">
+      <w:start w:val="1"/>
+      <w:numFmt w:val="bullet"/>
+      <w:lvlText w:val=""/>
+      <w:lvlJc w:val="left"/>
+      <w:pPr>
+        <w:tabs>
+          <w:tab w:val="num" w:pos="2160"/>
+        </w:tabs>
+        <w:ind w:left="2160" w:hanging="360"/>
+      </w:pPr>
+      <w:rPr>
+        <w:rFonts w:ascii="Wingdings" w:hAnsi="Wingdings" w:hint="default"/>
+        <w:sz w:val="20"/>
+      </w:rPr>
+    </w:lvl>
+    <w:lvl w:ilvl="3" w:tentative="1">
+      <w:start w:val="1"/>
+      <w:numFmt w:val="bullet"/>
+      <w:lvlText w:val=""/>
+      <w:lvlJc w:val="left"/>
+      <w:pPr>
+        <w:tabs>
+          <w:tab w:val="num" w:pos="2880"/>
+        </w:tabs>
+        <w:ind w:left="2880" w:hanging="360"/>
+      </w:pPr>
+      <w:rPr>
+        <w:rFonts w:ascii="Wingdings" w:hAnsi="Wingdings" w:hint="default"/>
+        <w:sz w:val="20"/>
+      </w:rPr>
+    </w:lvl>
+    <w:lvl w:ilvl="4" w:tentative="1">
+      <w:start w:val="1"/>
+      <w:numFmt w:val="bullet"/>
+      <w:lvlText w:val=""/>
+      <w:lvlJc w:val="left"/>
+      <w:pPr>
+        <w:tabs>
+          <w:tab w:val="num" w:pos="3600"/>
+        </w:tabs>
+        <w:ind w:left="3600" w:hanging="360"/>
+      </w:pPr>
+      <w:rPr>
+        <w:rFonts w:ascii="Wingdings" w:hAnsi="Wingdings" w:hint="default"/>
+        <w:sz w:val="20"/>
+      </w:rPr>
+    </w:lvl>
+    <w:lvl w:ilvl="5" w:tentative="1">
+      <w:start w:val="1"/>
+      <w:numFmt w:val="bullet"/>
+      <w:lvlText w:val=""/>
+      <w:lvlJc w:val="left"/>
+      <w:pPr>
+        <w:tabs>
+          <w:tab w:val="num" w:pos="4320"/>
+        </w:tabs>
+        <w:ind w:left="4320" w:hanging="360"/>
+      </w:pPr>
+      <w:rPr>
+        <w:rFonts w:ascii="Wingdings" w:hAnsi="Wingdings" w:hint="default"/>
+        <w:sz w:val="20"/>
+      </w:rPr>
+    </w:lvl>
+    <w:lvl w:ilvl="6" w:tentative="1">
+      <w:start w:val="1"/>
+      <w:numFmt w:val="bullet"/>
+      <w:lvlText w:val=""/>
+      <w:lvlJc w:val="left"/>
+      <w:pPr>
+        <w:tabs>
+          <w:tab w:val="num" w:pos="5040"/>
+        </w:tabs>
+        <w:ind w:left="5040" w:hanging="360"/>
+      </w:pPr>
+      <w:rPr>
+        <w:rFonts w:ascii="Wingdings" w:hAnsi="Wingdings" w:hint="default"/>
+        <w:sz w:val="20"/>
+      </w:rPr>
+    </w:lvl>
+    <w:lvl w:ilvl="7" w:tentative="1">
+      <w:start w:val="1"/>
+      <w:numFmt w:val="bullet"/>
+      <w:lvlText w:val=""/>
+      <w:lvlJc w:val="left"/>
+      <w:pPr>
+        <w:tabs>
+          <w:tab w:val="num" w:pos="5760"/>
+        </w:tabs>
+        <w:ind w:left="5760" w:hanging="360"/>
+      </w:pPr>
+      <w:rPr>
+        <w:rFonts w:ascii="Wingdings" w:hAnsi="Wingdings" w:hint="default"/>
+        <w:sz w:val="20"/>
+      </w:rPr>
+    </w:lvl>
+    <w:lvl w:ilvl="8" w:tentative="1">
+      <w:start w:val="1"/>
+      <w:numFmt w:val="bullet"/>
+      <w:lvlText w:val=""/>
+      <w:lvlJc w:val="left"/>
+      <w:pPr>
+        <w:tabs>
+          <w:tab w:val="num" w:pos="6480"/>
+        </w:tabs>
+        <w:ind w:left="6480" w:hanging="360"/>
+      </w:pPr>
+      <w:rPr>
+        <w:rFonts w:ascii="Wingdings" w:hAnsi="Wingdings" w:hint="default"/>
+        <w:sz w:val="20"/>
+      </w:rPr>
+    </w:lvl>
+  </w:abstractNum>
+  <w:abstractNum w:abstractNumId="49" w15:restartNumberingAfterBreak="0">
     <w:nsid w:val="5BA35407"/>
     <w:multiLevelType w:val="multilevel"/>
     <w:tmpl w:val="BE543726"/>
@@ -9477,7 +11667,7 @@
       </w:rPr>
     </w:lvl>
   </w:abstractNum>
-  <w:abstractNum w:abstractNumId="43" w15:restartNumberingAfterBreak="0">
+  <w:abstractNum w:abstractNumId="50" w15:restartNumberingAfterBreak="0">
     <w:nsid w:val="5BE17F32"/>
     <w:multiLevelType w:val="multilevel"/>
     <w:tmpl w:val="F01E6B74"/>
@@ -9626,7 +11816,7 @@
       </w:rPr>
     </w:lvl>
   </w:abstractNum>
-  <w:abstractNum w:abstractNumId="44" w15:restartNumberingAfterBreak="0">
+  <w:abstractNum w:abstractNumId="51" w15:restartNumberingAfterBreak="0">
     <w:nsid w:val="5E91390C"/>
     <w:multiLevelType w:val="multilevel"/>
     <w:tmpl w:val="74CE82E2"/>
@@ -9775,7 +11965,7 @@
       </w:rPr>
     </w:lvl>
   </w:abstractNum>
-  <w:abstractNum w:abstractNumId="45" w15:restartNumberingAfterBreak="0">
+  <w:abstractNum w:abstractNumId="52" w15:restartNumberingAfterBreak="0">
     <w:nsid w:val="61BD5B16"/>
     <w:multiLevelType w:val="multilevel"/>
     <w:tmpl w:val="5A46B4C8"/>
@@ -9924,7 +12114,156 @@
       </w:rPr>
     </w:lvl>
   </w:abstractNum>
-  <w:abstractNum w:abstractNumId="46" w15:restartNumberingAfterBreak="0">
+  <w:abstractNum w:abstractNumId="53" w15:restartNumberingAfterBreak="0">
+    <w:nsid w:val="64D0419D"/>
+    <w:multiLevelType w:val="multilevel"/>
+    <w:tmpl w:val="D1B8210C"/>
+    <w:lvl w:ilvl="0">
+      <w:start w:val="1"/>
+      <w:numFmt w:val="bullet"/>
+      <w:lvlText w:val=""/>
+      <w:lvlJc w:val="left"/>
+      <w:pPr>
+        <w:tabs>
+          <w:tab w:val="num" w:pos="720"/>
+        </w:tabs>
+        <w:ind w:left="720" w:hanging="360"/>
+      </w:pPr>
+      <w:rPr>
+        <w:rFonts w:ascii="Symbol" w:hAnsi="Symbol" w:hint="default"/>
+        <w:sz w:val="20"/>
+      </w:rPr>
+    </w:lvl>
+    <w:lvl w:ilvl="1">
+      <w:start w:val="1"/>
+      <w:numFmt w:val="bullet"/>
+      <w:lvlText w:val="o"/>
+      <w:lvlJc w:val="left"/>
+      <w:pPr>
+        <w:tabs>
+          <w:tab w:val="num" w:pos="1440"/>
+        </w:tabs>
+        <w:ind w:left="1440" w:hanging="360"/>
+      </w:pPr>
+      <w:rPr>
+        <w:rFonts w:ascii="Courier New" w:hAnsi="Courier New" w:hint="default"/>
+        <w:sz w:val="20"/>
+      </w:rPr>
+    </w:lvl>
+    <w:lvl w:ilvl="2" w:tentative="1">
+      <w:start w:val="1"/>
+      <w:numFmt w:val="bullet"/>
+      <w:lvlText w:val=""/>
+      <w:lvlJc w:val="left"/>
+      <w:pPr>
+        <w:tabs>
+          <w:tab w:val="num" w:pos="2160"/>
+        </w:tabs>
+        <w:ind w:left="2160" w:hanging="360"/>
+      </w:pPr>
+      <w:rPr>
+        <w:rFonts w:ascii="Wingdings" w:hAnsi="Wingdings" w:hint="default"/>
+        <w:sz w:val="20"/>
+      </w:rPr>
+    </w:lvl>
+    <w:lvl w:ilvl="3" w:tentative="1">
+      <w:start w:val="1"/>
+      <w:numFmt w:val="bullet"/>
+      <w:lvlText w:val=""/>
+      <w:lvlJc w:val="left"/>
+      <w:pPr>
+        <w:tabs>
+          <w:tab w:val="num" w:pos="2880"/>
+        </w:tabs>
+        <w:ind w:left="2880" w:hanging="360"/>
+      </w:pPr>
+      <w:rPr>
+        <w:rFonts w:ascii="Wingdings" w:hAnsi="Wingdings" w:hint="default"/>
+        <w:sz w:val="20"/>
+      </w:rPr>
+    </w:lvl>
+    <w:lvl w:ilvl="4" w:tentative="1">
+      <w:start w:val="1"/>
+      <w:numFmt w:val="bullet"/>
+      <w:lvlText w:val=""/>
+      <w:lvlJc w:val="left"/>
+      <w:pPr>
+        <w:tabs>
+          <w:tab w:val="num" w:pos="3600"/>
+        </w:tabs>
+        <w:ind w:left="3600" w:hanging="360"/>
+      </w:pPr>
+      <w:rPr>
+        <w:rFonts w:ascii="Wingdings" w:hAnsi="Wingdings" w:hint="default"/>
+        <w:sz w:val="20"/>
+      </w:rPr>
+    </w:lvl>
+    <w:lvl w:ilvl="5" w:tentative="1">
+      <w:start w:val="1"/>
+      <w:numFmt w:val="bullet"/>
+      <w:lvlText w:val=""/>
+      <w:lvlJc w:val="left"/>
+      <w:pPr>
+        <w:tabs>
+          <w:tab w:val="num" w:pos="4320"/>
+        </w:tabs>
+        <w:ind w:left="4320" w:hanging="360"/>
+      </w:pPr>
+      <w:rPr>
+        <w:rFonts w:ascii="Wingdings" w:hAnsi="Wingdings" w:hint="default"/>
+        <w:sz w:val="20"/>
+      </w:rPr>
+    </w:lvl>
+    <w:lvl w:ilvl="6" w:tentative="1">
+      <w:start w:val="1"/>
+      <w:numFmt w:val="bullet"/>
+      <w:lvlText w:val=""/>
+      <w:lvlJc w:val="left"/>
+      <w:pPr>
+        <w:tabs>
+          <w:tab w:val="num" w:pos="5040"/>
+        </w:tabs>
+        <w:ind w:left="5040" w:hanging="360"/>
+      </w:pPr>
+      <w:rPr>
+        <w:rFonts w:ascii="Wingdings" w:hAnsi="Wingdings" w:hint="default"/>
+        <w:sz w:val="20"/>
+      </w:rPr>
+    </w:lvl>
+    <w:lvl w:ilvl="7" w:tentative="1">
+      <w:start w:val="1"/>
+      <w:numFmt w:val="bullet"/>
+      <w:lvlText w:val=""/>
+      <w:lvlJc w:val="left"/>
+      <w:pPr>
+        <w:tabs>
+          <w:tab w:val="num" w:pos="5760"/>
+        </w:tabs>
+        <w:ind w:left="5760" w:hanging="360"/>
+      </w:pPr>
+      <w:rPr>
+        <w:rFonts w:ascii="Wingdings" w:hAnsi="Wingdings" w:hint="default"/>
+        <w:sz w:val="20"/>
+      </w:rPr>
+    </w:lvl>
+    <w:lvl w:ilvl="8" w:tentative="1">
+      <w:start w:val="1"/>
+      <w:numFmt w:val="bullet"/>
+      <w:lvlText w:val=""/>
+      <w:lvlJc w:val="left"/>
+      <w:pPr>
+        <w:tabs>
+          <w:tab w:val="num" w:pos="6480"/>
+        </w:tabs>
+        <w:ind w:left="6480" w:hanging="360"/>
+      </w:pPr>
+      <w:rPr>
+        <w:rFonts w:ascii="Wingdings" w:hAnsi="Wingdings" w:hint="default"/>
+        <w:sz w:val="20"/>
+      </w:rPr>
+    </w:lvl>
+  </w:abstractNum>
+  <w:abstractNum w:abstractNumId="54" w15:restartNumberingAfterBreak="0">
     <w:nsid w:val="693D0C9C"/>
     <w:multiLevelType w:val="multilevel"/>
     <w:tmpl w:val="C49C2C10"/>
@@ -10073,7 +12412,7 @@
       </w:rPr>
     </w:lvl>
   </w:abstractNum>
-  <w:abstractNum w:abstractNumId="47" w15:restartNumberingAfterBreak="0">
+  <w:abstractNum w:abstractNumId="55" w15:restartNumberingAfterBreak="0">
     <w:nsid w:val="6AC97E32"/>
     <w:multiLevelType w:val="multilevel"/>
     <w:tmpl w:val="110664A0"/>
@@ -10222,7 +12561,7 @@
       </w:rPr>
     </w:lvl>
   </w:abstractNum>
-  <w:abstractNum w:abstractNumId="48" w15:restartNumberingAfterBreak="0">
+  <w:abstractNum w:abstractNumId="56" w15:restartNumberingAfterBreak="0">
     <w:nsid w:val="6AE803C1"/>
     <w:multiLevelType w:val="multilevel"/>
     <w:tmpl w:val="59FA2664"/>
@@ -10371,7 +12710,7 @@
       </w:rPr>
     </w:lvl>
   </w:abstractNum>
-  <w:abstractNum w:abstractNumId="49" w15:restartNumberingAfterBreak="0">
+  <w:abstractNum w:abstractNumId="57" w15:restartNumberingAfterBreak="0">
     <w:nsid w:val="70CC129E"/>
     <w:multiLevelType w:val="multilevel"/>
     <w:tmpl w:val="C41AB28C"/>
@@ -10520,7 +12859,7 @@
       </w:rPr>
     </w:lvl>
   </w:abstractNum>
-  <w:abstractNum w:abstractNumId="50" w15:restartNumberingAfterBreak="0">
+  <w:abstractNum w:abstractNumId="58" w15:restartNumberingAfterBreak="0">
     <w:nsid w:val="726F4F64"/>
     <w:multiLevelType w:val="multilevel"/>
     <w:tmpl w:val="056A0EA6"/>
@@ -10633,7 +12972,7 @@
       </w:pPr>
     </w:lvl>
   </w:abstractNum>
-  <w:abstractNum w:abstractNumId="51" w15:restartNumberingAfterBreak="0">
+  <w:abstractNum w:abstractNumId="59" w15:restartNumberingAfterBreak="0">
     <w:nsid w:val="735A156E"/>
     <w:multiLevelType w:val="multilevel"/>
     <w:tmpl w:val="8E302BA2"/>
@@ -10782,7 +13121,7 @@
       </w:rPr>
     </w:lvl>
   </w:abstractNum>
-  <w:abstractNum w:abstractNumId="52" w15:restartNumberingAfterBreak="0">
+  <w:abstractNum w:abstractNumId="60" w15:restartNumberingAfterBreak="0">
     <w:nsid w:val="73A25F0F"/>
     <w:multiLevelType w:val="multilevel"/>
     <w:tmpl w:val="01907072"/>
@@ -10895,7 +13234,7 @@
       </w:pPr>
     </w:lvl>
   </w:abstractNum>
-  <w:abstractNum w:abstractNumId="53" w15:restartNumberingAfterBreak="0">
+  <w:abstractNum w:abstractNumId="61" w15:restartNumberingAfterBreak="0">
     <w:nsid w:val="74BB6C6A"/>
     <w:multiLevelType w:val="multilevel"/>
     <w:tmpl w:val="D2A80E58"/>
@@ -11044,7 +13383,7 @@
       </w:rPr>
     </w:lvl>
   </w:abstractNum>
-  <w:abstractNum w:abstractNumId="54" w15:restartNumberingAfterBreak="0">
+  <w:abstractNum w:abstractNumId="62" w15:restartNumberingAfterBreak="0">
     <w:nsid w:val="776D7063"/>
     <w:multiLevelType w:val="multilevel"/>
     <w:tmpl w:val="90BE55AC"/>
@@ -11157,7 +13496,7 @@
       </w:pPr>
     </w:lvl>
   </w:abstractNum>
-  <w:abstractNum w:abstractNumId="55" w15:restartNumberingAfterBreak="0">
+  <w:abstractNum w:abstractNumId="63" w15:restartNumberingAfterBreak="0">
     <w:nsid w:val="786807FE"/>
     <w:multiLevelType w:val="multilevel"/>
     <w:tmpl w:val="91DE6D60"/>
@@ -11306,7 +13645,7 @@
       </w:rPr>
     </w:lvl>
   </w:abstractNum>
-  <w:abstractNum w:abstractNumId="56" w15:restartNumberingAfterBreak="0">
+  <w:abstractNum w:abstractNumId="64" w15:restartNumberingAfterBreak="0">
     <w:nsid w:val="78772D0A"/>
     <w:multiLevelType w:val="multilevel"/>
     <w:tmpl w:val="146CC4D2"/>
@@ -11419,7 +13758,7 @@
       </w:pPr>
     </w:lvl>
   </w:abstractNum>
-  <w:abstractNum w:abstractNumId="57" w15:restartNumberingAfterBreak="0">
+  <w:abstractNum w:abstractNumId="65" w15:restartNumberingAfterBreak="0">
     <w:nsid w:val="79713A0F"/>
     <w:multiLevelType w:val="multilevel"/>
     <w:tmpl w:val="1B365A38"/>
@@ -11568,7 +13907,7 @@
       </w:rPr>
     </w:lvl>
   </w:abstractNum>
-  <w:abstractNum w:abstractNumId="58" w15:restartNumberingAfterBreak="0">
+  <w:abstractNum w:abstractNumId="66" w15:restartNumberingAfterBreak="0">
     <w:nsid w:val="79C54ED7"/>
     <w:multiLevelType w:val="multilevel"/>
     <w:tmpl w:val="C34A77B8"/>
@@ -11717,7 +14056,7 @@
       </w:rPr>
     </w:lvl>
   </w:abstractNum>
-  <w:abstractNum w:abstractNumId="59" w15:restartNumberingAfterBreak="0">
+  <w:abstractNum w:abstractNumId="67" w15:restartNumberingAfterBreak="0">
     <w:nsid w:val="7A00247D"/>
     <w:multiLevelType w:val="multilevel"/>
     <w:tmpl w:val="271A5E9A"/>
@@ -11866,7 +14205,7 @@
       </w:rPr>
     </w:lvl>
   </w:abstractNum>
-  <w:abstractNum w:abstractNumId="60" w15:restartNumberingAfterBreak="0">
+  <w:abstractNum w:abstractNumId="68" w15:restartNumberingAfterBreak="0">
     <w:nsid w:val="7DBA268E"/>
     <w:multiLevelType w:val="multilevel"/>
     <w:tmpl w:val="A8F0ADD2"/>
@@ -12015,7 +14354,7 @@
       </w:rPr>
     </w:lvl>
   </w:abstractNum>
-  <w:abstractNum w:abstractNumId="61" w15:restartNumberingAfterBreak="0">
+  <w:abstractNum w:abstractNumId="69" w15:restartNumberingAfterBreak="0">
     <w:nsid w:val="7F8A282A"/>
     <w:multiLevelType w:val="multilevel"/>
     <w:tmpl w:val="03565D26"/>
@@ -12165,190 +14504,214 @@
     </w:lvl>
   </w:abstractNum>
   <w:num w:numId="1" w16cid:durableId="1724281873">
-    <w:abstractNumId w:val="8"/>
+    <w:abstractNumId w:val="11"/>
   </w:num>
   <w:num w:numId="2" w16cid:durableId="2002151826">
-    <w:abstractNumId w:val="60"/>
+    <w:abstractNumId w:val="68"/>
   </w:num>
   <w:num w:numId="3" w16cid:durableId="1380127849">
-    <w:abstractNumId w:val="43"/>
+    <w:abstractNumId w:val="50"/>
   </w:num>
   <w:num w:numId="4" w16cid:durableId="739133798">
-    <w:abstractNumId w:val="14"/>
+    <w:abstractNumId w:val="18"/>
   </w:num>
   <w:num w:numId="5" w16cid:durableId="486750743">
     <w:abstractNumId w:val="0"/>
   </w:num>
   <w:num w:numId="6" w16cid:durableId="1349328618">
-    <w:abstractNumId w:val="24"/>
+    <w:abstractNumId w:val="29"/>
   </w:num>
   <w:num w:numId="7" w16cid:durableId="587543262">
-    <w:abstractNumId w:val="15"/>
+    <w:abstractNumId w:val="19"/>
   </w:num>
   <w:num w:numId="8" w16cid:durableId="1600724193">
-    <w:abstractNumId w:val="22"/>
+    <w:abstractNumId w:val="27"/>
   </w:num>
   <w:num w:numId="9" w16cid:durableId="1517305351">
-    <w:abstractNumId w:val="13"/>
+    <w:abstractNumId w:val="17"/>
   </w:num>
   <w:num w:numId="10" w16cid:durableId="1646424046">
-    <w:abstractNumId w:val="27"/>
+    <w:abstractNumId w:val="32"/>
   </w:num>
   <w:num w:numId="11" w16cid:durableId="1941571346">
-    <w:abstractNumId w:val="28"/>
+    <w:abstractNumId w:val="33"/>
   </w:num>
   <w:num w:numId="12" w16cid:durableId="832451499">
-    <w:abstractNumId w:val="56"/>
+    <w:abstractNumId w:val="64"/>
   </w:num>
   <w:num w:numId="13" w16cid:durableId="202599307">
-    <w:abstractNumId w:val="54"/>
+    <w:abstractNumId w:val="62"/>
   </w:num>
   <w:num w:numId="14" w16cid:durableId="969165280">
-    <w:abstractNumId w:val="50"/>
+    <w:abstractNumId w:val="58"/>
   </w:num>
   <w:num w:numId="15" w16cid:durableId="1494637010">
-    <w:abstractNumId w:val="26"/>
+    <w:abstractNumId w:val="31"/>
   </w:num>
   <w:num w:numId="16" w16cid:durableId="269092295">
     <w:abstractNumId w:val="2"/>
   </w:num>
   <w:num w:numId="17" w16cid:durableId="609168168">
+    <w:abstractNumId w:val="40"/>
+  </w:num>
+  <w:num w:numId="18" w16cid:durableId="690573749">
     <w:abstractNumId w:val="34"/>
   </w:num>
-  <w:num w:numId="18" w16cid:durableId="690573749">
-    <w:abstractNumId w:val="29"/>
-  </w:num>
   <w:num w:numId="19" w16cid:durableId="1411997856">
-    <w:abstractNumId w:val="38"/>
+    <w:abstractNumId w:val="44"/>
   </w:num>
   <w:num w:numId="20" w16cid:durableId="1254702901">
-    <w:abstractNumId w:val="18"/>
+    <w:abstractNumId w:val="22"/>
   </w:num>
   <w:num w:numId="21" w16cid:durableId="1998993882">
-    <w:abstractNumId w:val="9"/>
+    <w:abstractNumId w:val="13"/>
   </w:num>
   <w:num w:numId="22" w16cid:durableId="1064453846">
-    <w:abstractNumId w:val="19"/>
+    <w:abstractNumId w:val="23"/>
   </w:num>
   <w:num w:numId="23" w16cid:durableId="857037254">
-    <w:abstractNumId w:val="36"/>
+    <w:abstractNumId w:val="42"/>
   </w:num>
   <w:num w:numId="24" w16cid:durableId="1533374463">
-    <w:abstractNumId w:val="21"/>
+    <w:abstractNumId w:val="26"/>
   </w:num>
   <w:num w:numId="25" w16cid:durableId="532576354">
-    <w:abstractNumId w:val="30"/>
+    <w:abstractNumId w:val="35"/>
   </w:num>
   <w:num w:numId="26" w16cid:durableId="1237009035">
-    <w:abstractNumId w:val="16"/>
+    <w:abstractNumId w:val="20"/>
   </w:num>
   <w:num w:numId="27" w16cid:durableId="1121071321">
-    <w:abstractNumId w:val="11"/>
+    <w:abstractNumId w:val="15"/>
   </w:num>
   <w:num w:numId="28" w16cid:durableId="1941184309">
-    <w:abstractNumId w:val="20"/>
+    <w:abstractNumId w:val="25"/>
   </w:num>
   <w:num w:numId="29" w16cid:durableId="464540927">
-    <w:abstractNumId w:val="52"/>
+    <w:abstractNumId w:val="60"/>
   </w:num>
   <w:num w:numId="30" w16cid:durableId="1744788506">
     <w:abstractNumId w:val="3"/>
   </w:num>
   <w:num w:numId="31" w16cid:durableId="2124154702">
-    <w:abstractNumId w:val="17"/>
+    <w:abstractNumId w:val="21"/>
   </w:num>
   <w:num w:numId="32" w16cid:durableId="747967869">
-    <w:abstractNumId w:val="58"/>
+    <w:abstractNumId w:val="66"/>
   </w:num>
   <w:num w:numId="33" w16cid:durableId="566576081">
-    <w:abstractNumId w:val="37"/>
+    <w:abstractNumId w:val="43"/>
   </w:num>
   <w:num w:numId="34" w16cid:durableId="1404915931">
-    <w:abstractNumId w:val="46"/>
+    <w:abstractNumId w:val="54"/>
   </w:num>
   <w:num w:numId="35" w16cid:durableId="628390708">
-    <w:abstractNumId w:val="12"/>
+    <w:abstractNumId w:val="16"/>
   </w:num>
   <w:num w:numId="36" w16cid:durableId="40791008">
-    <w:abstractNumId w:val="33"/>
+    <w:abstractNumId w:val="39"/>
   </w:num>
   <w:num w:numId="37" w16cid:durableId="1461219777">
-    <w:abstractNumId w:val="41"/>
+    <w:abstractNumId w:val="47"/>
   </w:num>
   <w:num w:numId="38" w16cid:durableId="797989329">
-    <w:abstractNumId w:val="23"/>
+    <w:abstractNumId w:val="28"/>
   </w:num>
   <w:num w:numId="39" w16cid:durableId="1058627228">
     <w:abstractNumId w:val="1"/>
   </w:num>
   <w:num w:numId="40" w16cid:durableId="1940871936">
-    <w:abstractNumId w:val="39"/>
+    <w:abstractNumId w:val="45"/>
   </w:num>
   <w:num w:numId="41" w16cid:durableId="245772461">
-    <w:abstractNumId w:val="42"/>
+    <w:abstractNumId w:val="49"/>
   </w:num>
   <w:num w:numId="42" w16cid:durableId="1094714430">
-    <w:abstractNumId w:val="7"/>
+    <w:abstractNumId w:val="10"/>
   </w:num>
   <w:num w:numId="43" w16cid:durableId="1465152456">
-    <w:abstractNumId w:val="44"/>
+    <w:abstractNumId w:val="51"/>
   </w:num>
   <w:num w:numId="44" w16cid:durableId="1852142515">
+    <w:abstractNumId w:val="69"/>
+  </w:num>
+  <w:num w:numId="45" w16cid:durableId="1510288211">
     <w:abstractNumId w:val="61"/>
   </w:num>
-  <w:num w:numId="45" w16cid:durableId="1510288211">
-    <w:abstractNumId w:val="53"/>
-  </w:num>
   <w:num w:numId="46" w16cid:durableId="1565601731">
-    <w:abstractNumId w:val="32"/>
+    <w:abstractNumId w:val="37"/>
   </w:num>
   <w:num w:numId="47" w16cid:durableId="1758600418">
-    <w:abstractNumId w:val="5"/>
+    <w:abstractNumId w:val="6"/>
   </w:num>
   <w:num w:numId="48" w16cid:durableId="1826973159">
-    <w:abstractNumId w:val="35"/>
+    <w:abstractNumId w:val="41"/>
   </w:num>
   <w:num w:numId="49" w16cid:durableId="1270627855">
     <w:abstractNumId w:val="4"/>
   </w:num>
   <w:num w:numId="50" w16cid:durableId="1793790494">
+    <w:abstractNumId w:val="67"/>
+  </w:num>
+  <w:num w:numId="51" w16cid:durableId="1607958459">
+    <w:abstractNumId w:val="30"/>
+  </w:num>
+  <w:num w:numId="52" w16cid:durableId="1447384426">
+    <w:abstractNumId w:val="55"/>
+  </w:num>
+  <w:num w:numId="53" w16cid:durableId="840630847">
+    <w:abstractNumId w:val="63"/>
+  </w:num>
+  <w:num w:numId="54" w16cid:durableId="2073773813">
+    <w:abstractNumId w:val="46"/>
+  </w:num>
+  <w:num w:numId="55" w16cid:durableId="910962445">
+    <w:abstractNumId w:val="65"/>
+  </w:num>
+  <w:num w:numId="56" w16cid:durableId="55246951">
+    <w:abstractNumId w:val="36"/>
+  </w:num>
+  <w:num w:numId="57" w16cid:durableId="590046296">
+    <w:abstractNumId w:val="8"/>
+  </w:num>
+  <w:num w:numId="58" w16cid:durableId="1966039410">
+    <w:abstractNumId w:val="52"/>
+  </w:num>
+  <w:num w:numId="59" w16cid:durableId="795217890">
+    <w:abstractNumId w:val="14"/>
+  </w:num>
+  <w:num w:numId="60" w16cid:durableId="561409240">
     <w:abstractNumId w:val="59"/>
   </w:num>
-  <w:num w:numId="51" w16cid:durableId="1607958459">
-    <w:abstractNumId w:val="25"/>
+  <w:num w:numId="61" w16cid:durableId="737362927">
+    <w:abstractNumId w:val="56"/>
   </w:num>
-  <w:num w:numId="52" w16cid:durableId="1447384426">
-    <w:abstractNumId w:val="47"/>
-  </w:num>
-  <w:num w:numId="53" w16cid:durableId="840630847">
-    <w:abstractNumId w:val="55"/>
-  </w:num>
-  <w:num w:numId="54" w16cid:durableId="2073773813">
-    <w:abstractNumId w:val="40"/>
-  </w:num>
-  <w:num w:numId="55" w16cid:durableId="910962445">
+  <w:num w:numId="62" w16cid:durableId="500434389">
     <w:abstractNumId w:val="57"/>
   </w:num>
-  <w:num w:numId="56" w16cid:durableId="55246951">
-    <w:abstractNumId w:val="31"/>
+  <w:num w:numId="63" w16cid:durableId="661277535">
+    <w:abstractNumId w:val="53"/>
   </w:num>
-  <w:num w:numId="57" w16cid:durableId="590046296">
-    <w:abstractNumId w:val="6"/>
+  <w:num w:numId="64" w16cid:durableId="178587342">
+    <w:abstractNumId w:val="9"/>
   </w:num>
-  <w:num w:numId="58" w16cid:durableId="1966039410">
-    <w:abstractNumId w:val="45"/>
+  <w:num w:numId="65" w16cid:durableId="508761656">
+    <w:abstractNumId w:val="38"/>
   </w:num>
-  <w:num w:numId="59" w16cid:durableId="795217890">
-    <w:abstractNumId w:val="10"/>
+  <w:num w:numId="66" w16cid:durableId="721949332">
+    <w:abstractNumId w:val="7"/>
   </w:num>
-  <w:num w:numId="60" w16cid:durableId="561409240">
-    <w:abstractNumId w:val="51"/>
-  </w:num>
-  <w:num w:numId="61" w16cid:durableId="737362927">
+  <w:num w:numId="67" w16cid:durableId="1660037116">
     <w:abstractNumId w:val="48"/>
   </w:num>
-  <w:num w:numId="62" w16cid:durableId="500434389">
-    <w:abstractNumId w:val="49"/>
+  <w:num w:numId="68" w16cid:durableId="2126655925">
+    <w:abstractNumId w:val="12"/>
+  </w:num>
+  <w:num w:numId="69" w16cid:durableId="1897276401">
+    <w:abstractNumId w:val="24"/>
+  </w:num>
+  <w:num w:numId="70" w16cid:durableId="396511898">
+    <w:abstractNumId w:val="5"/>
   </w:num>
 </w:numbering>
 </file>

</xml_diff>